<commit_message>
fix(filters-deliverables): wire dynamic multi-domain filter engine to all 51 KPIs & 36 charts; regenerate Domain Suite Deliverables with 4 charts and headline KPIs per domain
</commit_message>
<xml_diff>
--- a/project_documents/documentation/RetailMart_V3_HR_Finance_Deliverable.docx
+++ b/project_documents/documentation/RetailMart_V3_HR_Finance_Deliverable.docx
@@ -23,19 +23,19 @@
         <w:rPr>
           <w:b/>
           <w:color w:val="0F172A"/>
-          <w:sz w:val="44"/>
+          <w:sz w:val="40"/>
         </w:rPr>
         <w:t>Human Resources &amp; Financial Governance Deliverable</w:t>
       </w:r>
     </w:p>
     <w:p>
       <w:pPr>
-        <w:spacing w:after="320"/>
+        <w:spacing w:after="280"/>
       </w:pPr>
       <w:r>
         <w:rPr>
           <w:color w:val="64748B"/>
-          <w:sz w:val="22"/>
+          <w:sz w:val="21"/>
         </w:rPr>
         <w:t>Domain Suite 3: Workforce Demographics, Compensation Structure, OPEX Ledger &amp; Treasury Liquidity</w:t>
       </w:r>
@@ -48,9 +48,9 @@
         <w:rPr>
           <w:b/>
           <w:color w:val="1E293B"/>
-          <w:sz w:val="28"/>
+          <w:sz w:val="26"/>
         </w:rPr>
-        <w:t>Headline Key Performance Indicators</w:t>
+        <w:t>Headline Key Performance Indicators (8 KPIs)</w:t>
       </w:r>
     </w:p>
     <w:tbl>
@@ -71,10 +71,10 @@
             <w:tcW w:type="dxa" w:w="2880"/>
             <w:shd w:fill="0F172A"/>
             <w:tcMar>
-              <w:top w:w="120" w:type="dxa"/>
-              <w:bottom w:w="120" w:type="dxa"/>
-              <w:left w:w="140" w:type="dxa"/>
-              <w:right w:w="140" w:type="dxa"/>
+              <w:top w:w="100" w:type="dxa"/>
+              <w:bottom w:w="100" w:type="dxa"/>
+              <w:left w:w="120" w:type="dxa"/>
+              <w:right w:w="120" w:type="dxa"/>
             </w:tcMar>
           </w:tcPr>
           <w:p>
@@ -85,9 +85,9 @@
               <w:rPr>
                 <w:b/>
                 <w:color w:val="FFFFFF"/>
-                <w:sz w:val="18"/>
+                <w:sz w:val="17"/>
               </w:rPr>
-              <w:t>KPI Name</w:t>
+              <w:t>KPI Title</w:t>
             </w:r>
           </w:p>
         </w:tc>
@@ -96,10 +96,10 @@
             <w:tcW w:type="dxa" w:w="2880"/>
             <w:shd w:fill="0F172A"/>
             <w:tcMar>
-              <w:top w:w="120" w:type="dxa"/>
-              <w:bottom w:w="120" w:type="dxa"/>
-              <w:left w:w="140" w:type="dxa"/>
-              <w:right w:w="140" w:type="dxa"/>
+              <w:top w:w="100" w:type="dxa"/>
+              <w:bottom w:w="100" w:type="dxa"/>
+              <w:left w:w="120" w:type="dxa"/>
+              <w:right w:w="120" w:type="dxa"/>
             </w:tcMar>
           </w:tcPr>
           <w:p>
@@ -110,7 +110,7 @@
               <w:rPr>
                 <w:b/>
                 <w:color w:val="FFFFFF"/>
-                <w:sz w:val="18"/>
+                <w:sz w:val="17"/>
               </w:rPr>
               <w:t>Performance Value</w:t>
             </w:r>
@@ -121,10 +121,10 @@
             <w:tcW w:type="dxa" w:w="2880"/>
             <w:shd w:fill="0F172A"/>
             <w:tcMar>
-              <w:top w:w="120" w:type="dxa"/>
-              <w:bottom w:w="120" w:type="dxa"/>
-              <w:left w:w="140" w:type="dxa"/>
-              <w:right w:w="140" w:type="dxa"/>
+              <w:top w:w="100" w:type="dxa"/>
+              <w:bottom w:w="100" w:type="dxa"/>
+              <w:left w:w="120" w:type="dxa"/>
+              <w:right w:w="120" w:type="dxa"/>
             </w:tcMar>
           </w:tcPr>
           <w:p>
@@ -135,9 +135,9 @@
               <w:rPr>
                 <w:b/>
                 <w:color w:val="FFFFFF"/>
-                <w:sz w:val="18"/>
+                <w:sz w:val="17"/>
               </w:rPr>
-              <w:t>Operational Context</w:t>
+              <w:t>Operational Subtext</w:t>
             </w:r>
           </w:p>
         </w:tc>
@@ -148,19 +148,19 @@
             <w:tcW w:type="dxa" w:w="2880"/>
             <w:shd w:fill="FFFFFF"/>
             <w:tcMar>
-              <w:top w:w="80" w:type="dxa"/>
-              <w:bottom w:w="80" w:type="dxa"/>
-              <w:left w:w="140" w:type="dxa"/>
-              <w:right w:w="140" w:type="dxa"/>
+              <w:top w:w="70" w:type="dxa"/>
+              <w:bottom w:w="70" w:type="dxa"/>
+              <w:left w:w="120" w:type="dxa"/>
+              <w:right w:w="120" w:type="dxa"/>
             </w:tcMar>
           </w:tcPr>
           <w:p>
             <w:r>
               <w:rPr>
                 <w:color w:val="334155"/>
-                <w:sz w:val="17"/>
+                <w:sz w:val="16"/>
               </w:rPr>
-              <w:t>Active Workforce</w:t>
+              <w:t>Active Headcount</w:t>
             </w:r>
           </w:p>
         </w:tc>
@@ -169,17 +169,17 @@
             <w:tcW w:type="dxa" w:w="2880"/>
             <w:shd w:fill="FFFFFF"/>
             <w:tcMar>
-              <w:top w:w="80" w:type="dxa"/>
-              <w:bottom w:w="80" w:type="dxa"/>
-              <w:left w:w="140" w:type="dxa"/>
-              <w:right w:w="140" w:type="dxa"/>
+              <w:top w:w="70" w:type="dxa"/>
+              <w:bottom w:w="70" w:type="dxa"/>
+              <w:left w:w="120" w:type="dxa"/>
+              <w:right w:w="120" w:type="dxa"/>
             </w:tcMar>
           </w:tcPr>
           <w:p>
             <w:r>
               <w:rPr>
                 <w:color w:val="334155"/>
-                <w:sz w:val="17"/>
+                <w:sz w:val="16"/>
               </w:rPr>
               <w:t>3,000 Staff</w:t>
             </w:r>
@@ -190,19 +190,19 @@
             <w:tcW w:type="dxa" w:w="2880"/>
             <w:shd w:fill="FFFFFF"/>
             <w:tcMar>
-              <w:top w:w="80" w:type="dxa"/>
-              <w:bottom w:w="80" w:type="dxa"/>
-              <w:left w:w="140" w:type="dxa"/>
-              <w:right w:w="140" w:type="dxa"/>
+              <w:top w:w="70" w:type="dxa"/>
+              <w:bottom w:w="70" w:type="dxa"/>
+              <w:left w:w="120" w:type="dxa"/>
+              <w:right w:w="120" w:type="dxa"/>
             </w:tcMar>
           </w:tcPr>
           <w:p>
             <w:r>
               <w:rPr>
                 <w:color w:val="334155"/>
-                <w:sz w:val="17"/>
+                <w:sz w:val="16"/>
               </w:rPr>
-              <w:t>100% active across 10 depts</w:t>
+              <w:t>100% active across 10 corporate depts</w:t>
             </w:r>
           </w:p>
         </w:tc>
@@ -213,17 +213,17 @@
             <w:tcW w:type="dxa" w:w="2880"/>
             <w:shd w:fill="F8FAFC"/>
             <w:tcMar>
-              <w:top w:w="80" w:type="dxa"/>
-              <w:bottom w:w="80" w:type="dxa"/>
-              <w:left w:w="140" w:type="dxa"/>
-              <w:right w:w="140" w:type="dxa"/>
+              <w:top w:w="70" w:type="dxa"/>
+              <w:bottom w:w="70" w:type="dxa"/>
+              <w:left w:w="120" w:type="dxa"/>
+              <w:right w:w="120" w:type="dxa"/>
             </w:tcMar>
           </w:tcPr>
           <w:p>
             <w:r>
               <w:rPr>
                 <w:color w:val="334155"/>
-                <w:sz w:val="17"/>
+                <w:sz w:val="16"/>
               </w:rPr>
               <w:t>Monthly Base Payroll</w:t>
             </w:r>
@@ -234,17 +234,17 @@
             <w:tcW w:type="dxa" w:w="2880"/>
             <w:shd w:fill="F8FAFC"/>
             <w:tcMar>
-              <w:top w:w="80" w:type="dxa"/>
-              <w:bottom w:w="80" w:type="dxa"/>
-              <w:left w:w="140" w:type="dxa"/>
-              <w:right w:w="140" w:type="dxa"/>
+              <w:top w:w="70" w:type="dxa"/>
+              <w:bottom w:w="70" w:type="dxa"/>
+              <w:left w:w="120" w:type="dxa"/>
+              <w:right w:w="120" w:type="dxa"/>
             </w:tcMar>
           </w:tcPr>
           <w:p>
             <w:r>
               <w:rPr>
                 <w:color w:val="334155"/>
-                <w:sz w:val="17"/>
+                <w:sz w:val="16"/>
               </w:rPr>
               <w:t>₹18.98 Cr</w:t>
             </w:r>
@@ -255,19 +255,19 @@
             <w:tcW w:type="dxa" w:w="2880"/>
             <w:shd w:fill="F8FAFC"/>
             <w:tcMar>
-              <w:top w:w="80" w:type="dxa"/>
-              <w:bottom w:w="80" w:type="dxa"/>
-              <w:left w:w="140" w:type="dxa"/>
-              <w:right w:w="140" w:type="dxa"/>
+              <w:top w:w="70" w:type="dxa"/>
+              <w:bottom w:w="70" w:type="dxa"/>
+              <w:left w:w="120" w:type="dxa"/>
+              <w:right w:w="120" w:type="dxa"/>
             </w:tcMar>
           </w:tcPr>
           <w:p>
             <w:r>
               <w:rPr>
                 <w:color w:val="334155"/>
-                <w:sz w:val="17"/>
+                <w:sz w:val="16"/>
               </w:rPr>
-              <w:t>₹189,800,000 contractual payroll</w:t>
+              <w:t>₹189,820,814 contractual monthly run-rate</w:t>
             </w:r>
           </w:p>
         </w:tc>
@@ -278,19 +278,19 @@
             <w:tcW w:type="dxa" w:w="2880"/>
             <w:shd w:fill="FFFFFF"/>
             <w:tcMar>
-              <w:top w:w="80" w:type="dxa"/>
-              <w:bottom w:w="80" w:type="dxa"/>
-              <w:left w:w="140" w:type="dxa"/>
-              <w:right w:w="140" w:type="dxa"/>
+              <w:top w:w="70" w:type="dxa"/>
+              <w:bottom w:w="70" w:type="dxa"/>
+              <w:left w:w="120" w:type="dxa"/>
+              <w:right w:w="120" w:type="dxa"/>
             </w:tcMar>
           </w:tcPr>
           <w:p>
             <w:r>
               <w:rPr>
                 <w:color w:val="334155"/>
-                <w:sz w:val="17"/>
+                <w:sz w:val="16"/>
               </w:rPr>
-              <w:t>Average Base Salary</w:t>
+              <w:t>Average Monthly Salary</w:t>
             </w:r>
           </w:p>
         </w:tc>
@@ -299,17 +299,17 @@
             <w:tcW w:type="dxa" w:w="2880"/>
             <w:shd w:fill="FFFFFF"/>
             <w:tcMar>
-              <w:top w:w="80" w:type="dxa"/>
-              <w:bottom w:w="80" w:type="dxa"/>
-              <w:left w:w="140" w:type="dxa"/>
-              <w:right w:w="140" w:type="dxa"/>
+              <w:top w:w="70" w:type="dxa"/>
+              <w:bottom w:w="70" w:type="dxa"/>
+              <w:left w:w="120" w:type="dxa"/>
+              <w:right w:w="120" w:type="dxa"/>
             </w:tcMar>
           </w:tcPr>
           <w:p>
             <w:r>
               <w:rPr>
                 <w:color w:val="334155"/>
-                <w:sz w:val="17"/>
+                <w:sz w:val="16"/>
               </w:rPr>
               <w:t>₹63,267</w:t>
             </w:r>
@@ -320,19 +320,19 @@
             <w:tcW w:type="dxa" w:w="2880"/>
             <w:shd w:fill="FFFFFF"/>
             <w:tcMar>
-              <w:top w:w="80" w:type="dxa"/>
-              <w:bottom w:w="80" w:type="dxa"/>
-              <w:left w:w="140" w:type="dxa"/>
-              <w:right w:w="140" w:type="dxa"/>
+              <w:top w:w="70" w:type="dxa"/>
+              <w:bottom w:w="70" w:type="dxa"/>
+              <w:left w:w="120" w:type="dxa"/>
+              <w:right w:w="120" w:type="dxa"/>
             </w:tcMar>
           </w:tcPr>
           <w:p>
             <w:r>
               <w:rPr>
                 <w:color w:val="334155"/>
-                <w:sz w:val="17"/>
+                <w:sz w:val="16"/>
               </w:rPr>
-              <w:t>Median salary ₹55,000 / month</w:t>
+              <w:t>Median compensation: ₹55,000</w:t>
             </w:r>
           </w:p>
         </w:tc>
@@ -343,19 +343,19 @@
             <w:tcW w:type="dxa" w:w="2880"/>
             <w:shd w:fill="F8FAFC"/>
             <w:tcMar>
-              <w:top w:w="80" w:type="dxa"/>
-              <w:bottom w:w="80" w:type="dxa"/>
-              <w:left w:w="140" w:type="dxa"/>
-              <w:right w:w="140" w:type="dxa"/>
+              <w:top w:w="70" w:type="dxa"/>
+              <w:bottom w:w="70" w:type="dxa"/>
+              <w:left w:w="120" w:type="dxa"/>
+              <w:right w:w="120" w:type="dxa"/>
             </w:tcMar>
           </w:tcPr>
           <w:p>
             <w:r>
               <w:rPr>
                 <w:color w:val="334155"/>
-                <w:sz w:val="17"/>
+                <w:sz w:val="16"/>
               </w:rPr>
-              <w:t>Corporate OPEX</w:t>
+              <w:t>Shift Attendance Compliance</w:t>
             </w:r>
           </w:p>
         </w:tc>
@@ -364,19 +364,19 @@
             <w:tcW w:type="dxa" w:w="2880"/>
             <w:shd w:fill="F8FAFC"/>
             <w:tcMar>
-              <w:top w:w="80" w:type="dxa"/>
-              <w:bottom w:w="80" w:type="dxa"/>
-              <w:left w:w="140" w:type="dxa"/>
-              <w:right w:w="140" w:type="dxa"/>
+              <w:top w:w="70" w:type="dxa"/>
+              <w:bottom w:w="70" w:type="dxa"/>
+              <w:left w:w="120" w:type="dxa"/>
+              <w:right w:w="120" w:type="dxa"/>
             </w:tcMar>
           </w:tcPr>
           <w:p>
             <w:r>
               <w:rPr>
                 <w:color w:val="334155"/>
-                <w:sz w:val="17"/>
+                <w:sz w:val="16"/>
               </w:rPr>
-              <w:t>₹42.15 Cr</w:t>
+              <w:t>94.60%</w:t>
             </w:r>
           </w:p>
         </w:tc>
@@ -385,19 +385,19 @@
             <w:tcW w:type="dxa" w:w="2880"/>
             <w:shd w:fill="F8FAFC"/>
             <w:tcMar>
-              <w:top w:w="80" w:type="dxa"/>
-              <w:bottom w:w="80" w:type="dxa"/>
-              <w:left w:w="140" w:type="dxa"/>
-              <w:right w:w="140" w:type="dxa"/>
+              <w:top w:w="70" w:type="dxa"/>
+              <w:bottom w:w="70" w:type="dxa"/>
+              <w:left w:w="120" w:type="dxa"/>
+              <w:right w:w="120" w:type="dxa"/>
             </w:tcMar>
           </w:tcPr>
           <w:p>
             <w:r>
               <w:rPr>
                 <w:color w:val="334155"/>
-                <w:sz w:val="17"/>
+                <w:sz w:val="16"/>
               </w:rPr>
-              <w:t>Technology, Admin, HQ overhead</w:t>
+              <w:t>26-month shift adherence rate</w:t>
             </w:r>
           </w:p>
         </w:tc>
@@ -408,19 +408,19 @@
             <w:tcW w:type="dxa" w:w="2880"/>
             <w:shd w:fill="FFFFFF"/>
             <w:tcMar>
-              <w:top w:w="80" w:type="dxa"/>
-              <w:bottom w:w="80" w:type="dxa"/>
-              <w:left w:w="140" w:type="dxa"/>
-              <w:right w:w="140" w:type="dxa"/>
+              <w:top w:w="70" w:type="dxa"/>
+              <w:bottom w:w="70" w:type="dxa"/>
+              <w:left w:w="120" w:type="dxa"/>
+              <w:right w:w="120" w:type="dxa"/>
             </w:tcMar>
           </w:tcPr>
           <w:p>
             <w:r>
               <w:rPr>
                 <w:color w:val="334155"/>
-                <w:sz w:val="17"/>
+                <w:sz w:val="16"/>
               </w:rPr>
-              <w:t>Store Branch OPEX</w:t>
+              <w:t>Delivered Net Revenue</w:t>
             </w:r>
           </w:p>
         </w:tc>
@@ -429,19 +429,19 @@
             <w:tcW w:type="dxa" w:w="2880"/>
             <w:shd w:fill="FFFFFF"/>
             <w:tcMar>
-              <w:top w:w="80" w:type="dxa"/>
-              <w:bottom w:w="80" w:type="dxa"/>
-              <w:left w:w="140" w:type="dxa"/>
-              <w:right w:w="140" w:type="dxa"/>
+              <w:top w:w="70" w:type="dxa"/>
+              <w:bottom w:w="70" w:type="dxa"/>
+              <w:left w:w="120" w:type="dxa"/>
+              <w:right w:w="120" w:type="dxa"/>
             </w:tcMar>
           </w:tcPr>
           <w:p>
             <w:r>
               <w:rPr>
                 <w:color w:val="334155"/>
-                <w:sz w:val="17"/>
+                <w:sz w:val="16"/>
               </w:rPr>
-              <w:t>₹38.80 Cr</w:t>
+              <w:t>₹676.95 Cr</w:t>
             </w:r>
           </w:p>
         </w:tc>
@@ -450,19 +450,19 @@
             <w:tcW w:type="dxa" w:w="2880"/>
             <w:shd w:fill="FFFFFF"/>
             <w:tcMar>
-              <w:top w:w="80" w:type="dxa"/>
-              <w:bottom w:w="80" w:type="dxa"/>
-              <w:left w:w="140" w:type="dxa"/>
-              <w:right w:w="140" w:type="dxa"/>
+              <w:top w:w="70" w:type="dxa"/>
+              <w:bottom w:w="70" w:type="dxa"/>
+              <w:left w:w="120" w:type="dxa"/>
+              <w:right w:w="120" w:type="dxa"/>
             </w:tcMar>
           </w:tcPr>
           <w:p>
             <w:r>
               <w:rPr>
                 <w:color w:val="334155"/>
-                <w:sz w:val="17"/>
+                <w:sz w:val="16"/>
               </w:rPr>
-              <w:t>Store leases, utilities, maintenance</w:t>
+              <w:t>₹6,769,536,004 enterprise top-line</w:t>
             </w:r>
           </w:p>
         </w:tc>
@@ -473,19 +473,19 @@
             <w:tcW w:type="dxa" w:w="2880"/>
             <w:shd w:fill="F8FAFC"/>
             <w:tcMar>
-              <w:top w:w="80" w:type="dxa"/>
-              <w:bottom w:w="80" w:type="dxa"/>
-              <w:left w:w="140" w:type="dxa"/>
-              <w:right w:w="140" w:type="dxa"/>
+              <w:top w:w="70" w:type="dxa"/>
+              <w:bottom w:w="70" w:type="dxa"/>
+              <w:left w:w="120" w:type="dxa"/>
+              <w:right w:w="120" w:type="dxa"/>
             </w:tcMar>
           </w:tcPr>
           <w:p>
             <w:r>
               <w:rPr>
                 <w:color w:val="334155"/>
-                <w:sz w:val="17"/>
+                <w:sz w:val="16"/>
               </w:rPr>
-              <w:t>Refund Financial Impact</w:t>
+              <w:t>Store Branch OPEX</w:t>
             </w:r>
           </w:p>
         </w:tc>
@@ -494,19 +494,19 @@
             <w:tcW w:type="dxa" w:w="2880"/>
             <w:shd w:fill="F8FAFC"/>
             <w:tcMar>
-              <w:top w:w="80" w:type="dxa"/>
-              <w:bottom w:w="80" w:type="dxa"/>
-              <w:left w:w="140" w:type="dxa"/>
-              <w:right w:w="140" w:type="dxa"/>
+              <w:top w:w="70" w:type="dxa"/>
+              <w:bottom w:w="70" w:type="dxa"/>
+              <w:left w:w="120" w:type="dxa"/>
+              <w:right w:w="120" w:type="dxa"/>
             </w:tcMar>
           </w:tcPr>
           <w:p>
             <w:r>
               <w:rPr>
                 <w:color w:val="334155"/>
-                <w:sz w:val="17"/>
+                <w:sz w:val="16"/>
               </w:rPr>
-              <w:t>₹14.20 Cr</w:t>
+              <w:t>₹38.80 Cr</w:t>
             </w:r>
           </w:p>
         </w:tc>
@@ -515,19 +515,149 @@
             <w:tcW w:type="dxa" w:w="2880"/>
             <w:shd w:fill="F8FAFC"/>
             <w:tcMar>
-              <w:top w:w="80" w:type="dxa"/>
-              <w:bottom w:w="80" w:type="dxa"/>
-              <w:left w:w="140" w:type="dxa"/>
-              <w:right w:w="140" w:type="dxa"/>
+              <w:top w:w="70" w:type="dxa"/>
+              <w:bottom w:w="70" w:type="dxa"/>
+              <w:left w:w="120" w:type="dxa"/>
+              <w:right w:w="120" w:type="dxa"/>
             </w:tcMar>
           </w:tcPr>
           <w:p>
             <w:r>
               <w:rPr>
                 <w:color w:val="334155"/>
-                <w:sz w:val="17"/>
+                <w:sz w:val="16"/>
               </w:rPr>
-              <w:t>Clawback on returned customer orders</w:t>
+              <w:t>Branch leases, utilities &amp; maintenance</w:t>
+            </w:r>
+          </w:p>
+        </w:tc>
+      </w:tr>
+      <w:tr>
+        <w:tc>
+          <w:tcPr>
+            <w:tcW w:type="dxa" w:w="2880"/>
+            <w:shd w:fill="FFFFFF"/>
+            <w:tcMar>
+              <w:top w:w="70" w:type="dxa"/>
+              <w:bottom w:w="70" w:type="dxa"/>
+              <w:left w:w="120" w:type="dxa"/>
+              <w:right w:w="120" w:type="dxa"/>
+            </w:tcMar>
+          </w:tcPr>
+          <w:p>
+            <w:r>
+              <w:rPr>
+                <w:color w:val="334155"/>
+                <w:sz w:val="16"/>
+              </w:rPr>
+              <w:t>Corporate HQ OPEX</w:t>
+            </w:r>
+          </w:p>
+        </w:tc>
+        <w:tc>
+          <w:tcPr>
+            <w:tcW w:type="dxa" w:w="2880"/>
+            <w:shd w:fill="FFFFFF"/>
+            <w:tcMar>
+              <w:top w:w="70" w:type="dxa"/>
+              <w:bottom w:w="70" w:type="dxa"/>
+              <w:left w:w="120" w:type="dxa"/>
+              <w:right w:w="120" w:type="dxa"/>
+            </w:tcMar>
+          </w:tcPr>
+          <w:p>
+            <w:r>
+              <w:rPr>
+                <w:color w:val="334155"/>
+                <w:sz w:val="16"/>
+              </w:rPr>
+              <w:t>₹42.15 Cr</w:t>
+            </w:r>
+          </w:p>
+        </w:tc>
+        <w:tc>
+          <w:tcPr>
+            <w:tcW w:type="dxa" w:w="2880"/>
+            <w:shd w:fill="FFFFFF"/>
+            <w:tcMar>
+              <w:top w:w="70" w:type="dxa"/>
+              <w:bottom w:w="70" w:type="dxa"/>
+              <w:left w:w="120" w:type="dxa"/>
+              <w:right w:w="120" w:type="dxa"/>
+            </w:tcMar>
+          </w:tcPr>
+          <w:p>
+            <w:r>
+              <w:rPr>
+                <w:color w:val="334155"/>
+                <w:sz w:val="16"/>
+              </w:rPr>
+              <w:t>Technology, admin &amp; marketing overhead</w:t>
+            </w:r>
+          </w:p>
+        </w:tc>
+      </w:tr>
+      <w:tr>
+        <w:tc>
+          <w:tcPr>
+            <w:tcW w:type="dxa" w:w="2880"/>
+            <w:shd w:fill="F8FAFC"/>
+            <w:tcMar>
+              <w:top w:w="70" w:type="dxa"/>
+              <w:bottom w:w="70" w:type="dxa"/>
+              <w:left w:w="120" w:type="dxa"/>
+              <w:right w:w="120" w:type="dxa"/>
+            </w:tcMar>
+          </w:tcPr>
+          <w:p>
+            <w:r>
+              <w:rPr>
+                <w:color w:val="334155"/>
+                <w:sz w:val="16"/>
+              </w:rPr>
+              <w:t>Gross Contribution Margin</w:t>
+            </w:r>
+          </w:p>
+        </w:tc>
+        <w:tc>
+          <w:tcPr>
+            <w:tcW w:type="dxa" w:w="2880"/>
+            <w:shd w:fill="F8FAFC"/>
+            <w:tcMar>
+              <w:top w:w="70" w:type="dxa"/>
+              <w:bottom w:w="70" w:type="dxa"/>
+              <w:left w:w="120" w:type="dxa"/>
+              <w:right w:w="120" w:type="dxa"/>
+            </w:tcMar>
+          </w:tcPr>
+          <w:p>
+            <w:r>
+              <w:rPr>
+                <w:color w:val="334155"/>
+                <w:sz w:val="16"/>
+              </w:rPr>
+              <w:t>30.47%</w:t>
+            </w:r>
+          </w:p>
+        </w:tc>
+        <w:tc>
+          <w:tcPr>
+            <w:tcW w:type="dxa" w:w="2880"/>
+            <w:shd w:fill="F8FAFC"/>
+            <w:tcMar>
+              <w:top w:w="70" w:type="dxa"/>
+              <w:bottom w:w="70" w:type="dxa"/>
+              <w:left w:w="120" w:type="dxa"/>
+              <w:right w:w="120" w:type="dxa"/>
+            </w:tcMar>
+          </w:tcPr>
+          <w:p>
+            <w:r>
+              <w:rPr>
+                <w:color w:val="334155"/>
+                <w:sz w:val="16"/>
+              </w:rPr>
+              <w:t>Gross margin minus direct store OPEX</w:t>
             </w:r>
           </w:p>
         </w:tc>
@@ -535,7 +665,7 @@
     </w:tbl>
     <w:p>
       <w:pPr>
-        <w:spacing w:after="200"/>
+        <w:spacing w:after="160"/>
       </w:pPr>
     </w:p>
     <w:p>
@@ -546,14 +676,75 @@
         <w:rPr>
           <w:b/>
           <w:color w:val="1E293B"/>
-          <w:sz w:val="28"/>
+          <w:sz w:val="26"/>
         </w:rPr>
-        <w:t>1. Departmental Workforce Headcount &amp; Payroll Allocation</w:t>
+        <w:t>1. Human Resources Domain: Department Headcount, Payroll Burdens &amp; Shift Roster</w:t>
       </w:r>
     </w:p>
     <w:p>
       <w:r>
-        <w:t>Distribution of 3,000 staff members across retail stores and corporate headquarters.</w:t>
+        <w:t>Workforce allocation of 3,000 employees across 10 departments, monthly compensation trajectory, shift schedules, and attendance compliance.</w:t>
+      </w:r>
+    </w:p>
+    <w:p>
+      <w:r>
+        <w:t>Associated Domain Visualizations in Dashboard:</w:t>
+      </w:r>
+    </w:p>
+    <w:p>
+      <w:pPr>
+        <w:pStyle w:val="ListBullet"/>
+      </w:pPr>
+      <w:r>
+        <w:rPr>
+          <w:b/>
+        </w:rPr>
+        <w:t xml:space="preserve">Chart 1 (Donut): </w:t>
+      </w:r>
+      <w:r>
+        <w:t>Headcount by Corporate Department (Store Ops 61.7%, Logistics 14.0%, IT 7.0%, Sales 6.0%, Finance 3.2%, Marketing 2.8%, HR 2.0%, Admin 3.3%)</w:t>
+      </w:r>
+    </w:p>
+    <w:p>
+      <w:pPr>
+        <w:pStyle w:val="ListBullet"/>
+      </w:pPr>
+      <w:r>
+        <w:rPr>
+          <w:b/>
+        </w:rPr>
+        <w:t xml:space="preserve">Chart 2 (Bar): </w:t>
+      </w:r>
+      <w:r>
+        <w:t>Monthly Payroll Burden Trend across 26 Months (₹18.98 Cr Monthly Run-rate)</w:t>
+      </w:r>
+    </w:p>
+    <w:p>
+      <w:pPr>
+        <w:pStyle w:val="ListBullet"/>
+      </w:pPr>
+      <w:r>
+        <w:rPr>
+          <w:b/>
+        </w:rPr>
+        <w:t xml:space="preserve">Chart 3 (Donut): </w:t>
+      </w:r>
+      <w:r>
+        <w:t>Shift Roster &amp; Employee Schedule Distribution (General Day 42.5%, Morning 28.4%, Evening 18.6%, Night 10.5%)</w:t>
+      </w:r>
+    </w:p>
+    <w:p>
+      <w:pPr>
+        <w:pStyle w:val="ListBullet"/>
+      </w:pPr>
+      <w:r>
+        <w:rPr>
+          <w:b/>
+        </w:rPr>
+        <w:t xml:space="preserve">Chart 4 (Line): </w:t>
+      </w:r>
+      <w:r>
+        <w:t>26-Month Monthly Shift Attendance &amp; Punctuality Rate (%)</w:t>
       </w:r>
     </w:p>
     <w:tbl>
@@ -564,22 +755,23 @@
         <w:tblLook w:firstColumn="1" w:firstRow="1" w:lastColumn="0" w:lastRow="0" w:noHBand="0" w:noVBand="1" w:val="04A0"/>
       </w:tblPr>
       <w:tblGrid>
-        <w:gridCol w:w="1728"/>
-        <w:gridCol w:w="1728"/>
-        <w:gridCol w:w="1728"/>
-        <w:gridCol w:w="1728"/>
-        <w:gridCol w:w="1728"/>
+        <w:gridCol w:w="1440"/>
+        <w:gridCol w:w="1440"/>
+        <w:gridCol w:w="1440"/>
+        <w:gridCol w:w="1440"/>
+        <w:gridCol w:w="1440"/>
+        <w:gridCol w:w="1440"/>
       </w:tblGrid>
       <w:tr>
         <w:tc>
           <w:tcPr>
-            <w:tcW w:type="dxa" w:w="1728"/>
+            <w:tcW w:type="dxa" w:w="1440"/>
             <w:shd w:fill="0F172A"/>
             <w:tcMar>
-              <w:top w:w="120" w:type="dxa"/>
-              <w:bottom w:w="120" w:type="dxa"/>
-              <w:left w:w="140" w:type="dxa"/>
-              <w:right w:w="140" w:type="dxa"/>
+              <w:top w:w="100" w:type="dxa"/>
+              <w:bottom w:w="100" w:type="dxa"/>
+              <w:left w:w="120" w:type="dxa"/>
+              <w:right w:w="120" w:type="dxa"/>
             </w:tcMar>
           </w:tcPr>
           <w:p>
@@ -590,21 +782,21 @@
               <w:rPr>
                 <w:b/>
                 <w:color w:val="FFFFFF"/>
-                <w:sz w:val="18"/>
+                <w:sz w:val="17"/>
               </w:rPr>
-              <w:t>Department</w:t>
+              <w:t>Department / Shift</w:t>
             </w:r>
           </w:p>
         </w:tc>
         <w:tc>
           <w:tcPr>
-            <w:tcW w:type="dxa" w:w="1728"/>
+            <w:tcW w:type="dxa" w:w="1440"/>
             <w:shd w:fill="0F172A"/>
             <w:tcMar>
-              <w:top w:w="120" w:type="dxa"/>
-              <w:bottom w:w="120" w:type="dxa"/>
-              <w:left w:w="140" w:type="dxa"/>
-              <w:right w:w="140" w:type="dxa"/>
+              <w:top w:w="100" w:type="dxa"/>
+              <w:bottom w:w="100" w:type="dxa"/>
+              <w:left w:w="120" w:type="dxa"/>
+              <w:right w:w="120" w:type="dxa"/>
             </w:tcMar>
           </w:tcPr>
           <w:p>
@@ -615,21 +807,21 @@
               <w:rPr>
                 <w:b/>
                 <w:color w:val="FFFFFF"/>
-                <w:sz w:val="18"/>
+                <w:sz w:val="17"/>
               </w:rPr>
-              <w:t>Staff Headcount</w:t>
+              <w:t>Staff Count</w:t>
             </w:r>
           </w:p>
         </w:tc>
         <w:tc>
           <w:tcPr>
-            <w:tcW w:type="dxa" w:w="1728"/>
+            <w:tcW w:type="dxa" w:w="1440"/>
             <w:shd w:fill="0F172A"/>
             <w:tcMar>
-              <w:top w:w="120" w:type="dxa"/>
-              <w:bottom w:w="120" w:type="dxa"/>
-              <w:left w:w="140" w:type="dxa"/>
-              <w:right w:w="140" w:type="dxa"/>
+              <w:top w:w="100" w:type="dxa"/>
+              <w:bottom w:w="100" w:type="dxa"/>
+              <w:left w:w="120" w:type="dxa"/>
+              <w:right w:w="120" w:type="dxa"/>
             </w:tcMar>
           </w:tcPr>
           <w:p>
@@ -640,7 +832,7 @@
               <w:rPr>
                 <w:b/>
                 <w:color w:val="FFFFFF"/>
-                <w:sz w:val="18"/>
+                <w:sz w:val="17"/>
               </w:rPr>
               <w:t>Headcount Share (%)</w:t>
             </w:r>
@@ -648,13 +840,13 @@
         </w:tc>
         <w:tc>
           <w:tcPr>
-            <w:tcW w:type="dxa" w:w="1728"/>
+            <w:tcW w:type="dxa" w:w="1440"/>
             <w:shd w:fill="0F172A"/>
             <w:tcMar>
-              <w:top w:w="120" w:type="dxa"/>
-              <w:bottom w:w="120" w:type="dxa"/>
-              <w:left w:w="140" w:type="dxa"/>
-              <w:right w:w="140" w:type="dxa"/>
+              <w:top w:w="100" w:type="dxa"/>
+              <w:bottom w:w="100" w:type="dxa"/>
+              <w:left w:w="120" w:type="dxa"/>
+              <w:right w:w="120" w:type="dxa"/>
             </w:tcMar>
           </w:tcPr>
           <w:p>
@@ -665,21 +857,21 @@
               <w:rPr>
                 <w:b/>
                 <w:color w:val="FFFFFF"/>
-                <w:sz w:val="18"/>
+                <w:sz w:val="17"/>
               </w:rPr>
-              <w:t>Monthly Payroll (₹)</w:t>
+              <w:t>Monthly Payroll (₹ Cr)</w:t>
             </w:r>
           </w:p>
         </w:tc>
         <w:tc>
           <w:tcPr>
-            <w:tcW w:type="dxa" w:w="1728"/>
+            <w:tcW w:type="dxa" w:w="1440"/>
             <w:shd w:fill="0F172A"/>
             <w:tcMar>
-              <w:top w:w="120" w:type="dxa"/>
-              <w:bottom w:w="120" w:type="dxa"/>
-              <w:left w:w="140" w:type="dxa"/>
-              <w:right w:w="140" w:type="dxa"/>
+              <w:top w:w="100" w:type="dxa"/>
+              <w:bottom w:w="100" w:type="dxa"/>
+              <w:left w:w="120" w:type="dxa"/>
+              <w:right w:w="120" w:type="dxa"/>
             </w:tcMar>
           </w:tcPr>
           <w:p>
@@ -690,9 +882,34 @@
               <w:rPr>
                 <w:b/>
                 <w:color w:val="FFFFFF"/>
-                <w:sz w:val="18"/>
+                <w:sz w:val="17"/>
               </w:rPr>
               <w:t>Avg Salary (₹)</w:t>
+            </w:r>
+          </w:p>
+        </w:tc>
+        <w:tc>
+          <w:tcPr>
+            <w:tcW w:type="dxa" w:w="1440"/>
+            <w:shd w:fill="0F172A"/>
+            <w:tcMar>
+              <w:top w:w="100" w:type="dxa"/>
+              <w:bottom w:w="100" w:type="dxa"/>
+              <w:left w:w="120" w:type="dxa"/>
+              <w:right w:w="120" w:type="dxa"/>
+            </w:tcMar>
+          </w:tcPr>
+          <w:p>
+            <w:pPr>
+              <w:jc w:val="left"/>
+            </w:pPr>
+            <w:r>
+              <w:rPr>
+                <w:b/>
+                <w:color w:val="FFFFFF"/>
+                <w:sz w:val="17"/>
+              </w:rPr>
+              <w:t>Compliance %</w:t>
             </w:r>
           </w:p>
         </w:tc>
@@ -700,41 +917,41 @@
       <w:tr>
         <w:tc>
           <w:tcPr>
-            <w:tcW w:type="dxa" w:w="1728"/>
+            <w:tcW w:type="dxa" w:w="1440"/>
             <w:shd w:fill="FFFFFF"/>
             <w:tcMar>
-              <w:top w:w="80" w:type="dxa"/>
-              <w:bottom w:w="80" w:type="dxa"/>
-              <w:left w:w="140" w:type="dxa"/>
-              <w:right w:w="140" w:type="dxa"/>
+              <w:top w:w="70" w:type="dxa"/>
+              <w:bottom w:w="70" w:type="dxa"/>
+              <w:left w:w="120" w:type="dxa"/>
+              <w:right w:w="120" w:type="dxa"/>
             </w:tcMar>
           </w:tcPr>
           <w:p>
             <w:r>
               <w:rPr>
                 <w:color w:val="334155"/>
-                <w:sz w:val="17"/>
+                <w:sz w:val="16"/>
               </w:rPr>
-              <w:t>Store Retail Operations</w:t>
+              <w:t>Store Operations &amp; Retail</w:t>
             </w:r>
           </w:p>
         </w:tc>
         <w:tc>
           <w:tcPr>
-            <w:tcW w:type="dxa" w:w="1728"/>
+            <w:tcW w:type="dxa" w:w="1440"/>
             <w:shd w:fill="FFFFFF"/>
             <w:tcMar>
-              <w:top w:w="80" w:type="dxa"/>
-              <w:bottom w:w="80" w:type="dxa"/>
-              <w:left w:w="140" w:type="dxa"/>
-              <w:right w:w="140" w:type="dxa"/>
+              <w:top w:w="70" w:type="dxa"/>
+              <w:bottom w:w="70" w:type="dxa"/>
+              <w:left w:w="120" w:type="dxa"/>
+              <w:right w:w="120" w:type="dxa"/>
             </w:tcMar>
           </w:tcPr>
           <w:p>
             <w:r>
               <w:rPr>
                 <w:color w:val="334155"/>
-                <w:sz w:val="17"/>
+                <w:sz w:val="16"/>
               </w:rPr>
               <w:t>1,850 Staff</w:t>
             </w:r>
@@ -742,20 +959,20 @@
         </w:tc>
         <w:tc>
           <w:tcPr>
-            <w:tcW w:type="dxa" w:w="1728"/>
+            <w:tcW w:type="dxa" w:w="1440"/>
             <w:shd w:fill="FFFFFF"/>
             <w:tcMar>
-              <w:top w:w="80" w:type="dxa"/>
-              <w:bottom w:w="80" w:type="dxa"/>
-              <w:left w:w="140" w:type="dxa"/>
-              <w:right w:w="140" w:type="dxa"/>
+              <w:top w:w="70" w:type="dxa"/>
+              <w:bottom w:w="70" w:type="dxa"/>
+              <w:left w:w="120" w:type="dxa"/>
+              <w:right w:w="120" w:type="dxa"/>
             </w:tcMar>
           </w:tcPr>
           <w:p>
             <w:r>
               <w:rPr>
                 <w:color w:val="334155"/>
-                <w:sz w:val="17"/>
+                <w:sz w:val="16"/>
               </w:rPr>
               <w:t>61.67%</w:t>
             </w:r>
@@ -763,20 +980,20 @@
         </w:tc>
         <w:tc>
           <w:tcPr>
-            <w:tcW w:type="dxa" w:w="1728"/>
+            <w:tcW w:type="dxa" w:w="1440"/>
             <w:shd w:fill="FFFFFF"/>
             <w:tcMar>
-              <w:top w:w="80" w:type="dxa"/>
-              <w:bottom w:w="80" w:type="dxa"/>
-              <w:left w:w="140" w:type="dxa"/>
-              <w:right w:w="140" w:type="dxa"/>
+              <w:top w:w="70" w:type="dxa"/>
+              <w:bottom w:w="70" w:type="dxa"/>
+              <w:left w:w="120" w:type="dxa"/>
+              <w:right w:w="120" w:type="dxa"/>
             </w:tcMar>
           </w:tcPr>
           <w:p>
             <w:r>
               <w:rPr>
                 <w:color w:val="334155"/>
-                <w:sz w:val="17"/>
+                <w:sz w:val="16"/>
               </w:rPr>
               <w:t>₹9.25 Cr</w:t>
             </w:r>
@@ -784,22 +1001,43 @@
         </w:tc>
         <w:tc>
           <w:tcPr>
-            <w:tcW w:type="dxa" w:w="1728"/>
+            <w:tcW w:type="dxa" w:w="1440"/>
             <w:shd w:fill="FFFFFF"/>
             <w:tcMar>
-              <w:top w:w="80" w:type="dxa"/>
-              <w:bottom w:w="80" w:type="dxa"/>
-              <w:left w:w="140" w:type="dxa"/>
-              <w:right w:w="140" w:type="dxa"/>
+              <w:top w:w="70" w:type="dxa"/>
+              <w:bottom w:w="70" w:type="dxa"/>
+              <w:left w:w="120" w:type="dxa"/>
+              <w:right w:w="120" w:type="dxa"/>
             </w:tcMar>
           </w:tcPr>
           <w:p>
             <w:r>
               <w:rPr>
                 <w:color w:val="334155"/>
-                <w:sz w:val="17"/>
+                <w:sz w:val="16"/>
               </w:rPr>
               <w:t>₹50,000</w:t>
+            </w:r>
+          </w:p>
+        </w:tc>
+        <w:tc>
+          <w:tcPr>
+            <w:tcW w:type="dxa" w:w="1440"/>
+            <w:shd w:fill="FFFFFF"/>
+            <w:tcMar>
+              <w:top w:w="70" w:type="dxa"/>
+              <w:bottom w:w="70" w:type="dxa"/>
+              <w:left w:w="120" w:type="dxa"/>
+              <w:right w:w="120" w:type="dxa"/>
+            </w:tcMar>
+          </w:tcPr>
+          <w:p>
+            <w:r>
+              <w:rPr>
+                <w:color w:val="334155"/>
+                <w:sz w:val="16"/>
+              </w:rPr>
+              <w:t>95.2% High</w:t>
             </w:r>
           </w:p>
         </w:tc>
@@ -807,20 +1045,20 @@
       <w:tr>
         <w:tc>
           <w:tcPr>
-            <w:tcW w:type="dxa" w:w="1728"/>
+            <w:tcW w:type="dxa" w:w="1440"/>
             <w:shd w:fill="F8FAFC"/>
             <w:tcMar>
-              <w:top w:w="80" w:type="dxa"/>
-              <w:bottom w:w="80" w:type="dxa"/>
-              <w:left w:w="140" w:type="dxa"/>
-              <w:right w:w="140" w:type="dxa"/>
+              <w:top w:w="70" w:type="dxa"/>
+              <w:bottom w:w="70" w:type="dxa"/>
+              <w:left w:w="120" w:type="dxa"/>
+              <w:right w:w="120" w:type="dxa"/>
             </w:tcMar>
           </w:tcPr>
           <w:p>
             <w:r>
               <w:rPr>
                 <w:color w:val="334155"/>
-                <w:sz w:val="17"/>
+                <w:sz w:val="16"/>
               </w:rPr>
               <w:t>Supply Chain &amp; Logistics</w:t>
             </w:r>
@@ -828,20 +1066,20 @@
         </w:tc>
         <w:tc>
           <w:tcPr>
-            <w:tcW w:type="dxa" w:w="1728"/>
+            <w:tcW w:type="dxa" w:w="1440"/>
             <w:shd w:fill="F8FAFC"/>
             <w:tcMar>
-              <w:top w:w="80" w:type="dxa"/>
-              <w:bottom w:w="80" w:type="dxa"/>
-              <w:left w:w="140" w:type="dxa"/>
-              <w:right w:w="140" w:type="dxa"/>
+              <w:top w:w="70" w:type="dxa"/>
+              <w:bottom w:w="70" w:type="dxa"/>
+              <w:left w:w="120" w:type="dxa"/>
+              <w:right w:w="120" w:type="dxa"/>
             </w:tcMar>
           </w:tcPr>
           <w:p>
             <w:r>
               <w:rPr>
                 <w:color w:val="334155"/>
-                <w:sz w:val="17"/>
+                <w:sz w:val="16"/>
               </w:rPr>
               <w:t>420 Staff</w:t>
             </w:r>
@@ -849,20 +1087,20 @@
         </w:tc>
         <w:tc>
           <w:tcPr>
-            <w:tcW w:type="dxa" w:w="1728"/>
+            <w:tcW w:type="dxa" w:w="1440"/>
             <w:shd w:fill="F8FAFC"/>
             <w:tcMar>
-              <w:top w:w="80" w:type="dxa"/>
-              <w:bottom w:w="80" w:type="dxa"/>
-              <w:left w:w="140" w:type="dxa"/>
-              <w:right w:w="140" w:type="dxa"/>
+              <w:top w:w="70" w:type="dxa"/>
+              <w:bottom w:w="70" w:type="dxa"/>
+              <w:left w:w="120" w:type="dxa"/>
+              <w:right w:w="120" w:type="dxa"/>
             </w:tcMar>
           </w:tcPr>
           <w:p>
             <w:r>
               <w:rPr>
                 <w:color w:val="334155"/>
-                <w:sz w:val="17"/>
+                <w:sz w:val="16"/>
               </w:rPr>
               <w:t>14.00%</w:t>
             </w:r>
@@ -870,20 +1108,20 @@
         </w:tc>
         <w:tc>
           <w:tcPr>
-            <w:tcW w:type="dxa" w:w="1728"/>
+            <w:tcW w:type="dxa" w:w="1440"/>
             <w:shd w:fill="F8FAFC"/>
             <w:tcMar>
-              <w:top w:w="80" w:type="dxa"/>
-              <w:bottom w:w="80" w:type="dxa"/>
-              <w:left w:w="140" w:type="dxa"/>
-              <w:right w:w="140" w:type="dxa"/>
+              <w:top w:w="70" w:type="dxa"/>
+              <w:bottom w:w="70" w:type="dxa"/>
+              <w:left w:w="120" w:type="dxa"/>
+              <w:right w:w="120" w:type="dxa"/>
             </w:tcMar>
           </w:tcPr>
           <w:p>
             <w:r>
               <w:rPr>
                 <w:color w:val="334155"/>
-                <w:sz w:val="17"/>
+                <w:sz w:val="16"/>
               </w:rPr>
               <w:t>₹2.73 Cr</w:t>
             </w:r>
@@ -891,22 +1129,43 @@
         </w:tc>
         <w:tc>
           <w:tcPr>
-            <w:tcW w:type="dxa" w:w="1728"/>
+            <w:tcW w:type="dxa" w:w="1440"/>
             <w:shd w:fill="F8FAFC"/>
             <w:tcMar>
-              <w:top w:w="80" w:type="dxa"/>
-              <w:bottom w:w="80" w:type="dxa"/>
-              <w:left w:w="140" w:type="dxa"/>
-              <w:right w:w="140" w:type="dxa"/>
+              <w:top w:w="70" w:type="dxa"/>
+              <w:bottom w:w="70" w:type="dxa"/>
+              <w:left w:w="120" w:type="dxa"/>
+              <w:right w:w="120" w:type="dxa"/>
             </w:tcMar>
           </w:tcPr>
           <w:p>
             <w:r>
               <w:rPr>
                 <w:color w:val="334155"/>
-                <w:sz w:val="17"/>
+                <w:sz w:val="16"/>
               </w:rPr>
               <w:t>₹65,000</w:t>
+            </w:r>
+          </w:p>
+        </w:tc>
+        <w:tc>
+          <w:tcPr>
+            <w:tcW w:type="dxa" w:w="1440"/>
+            <w:shd w:fill="F8FAFC"/>
+            <w:tcMar>
+              <w:top w:w="70" w:type="dxa"/>
+              <w:bottom w:w="70" w:type="dxa"/>
+              <w:left w:w="120" w:type="dxa"/>
+              <w:right w:w="120" w:type="dxa"/>
+            </w:tcMar>
+          </w:tcPr>
+          <w:p>
+            <w:r>
+              <w:rPr>
+                <w:color w:val="334155"/>
+                <w:sz w:val="16"/>
+              </w:rPr>
+              <w:t>94.8% Stable</w:t>
             </w:r>
           </w:p>
         </w:tc>
@@ -914,41 +1173,41 @@
       <w:tr>
         <w:tc>
           <w:tcPr>
-            <w:tcW w:type="dxa" w:w="1728"/>
+            <w:tcW w:type="dxa" w:w="1440"/>
             <w:shd w:fill="FFFFFF"/>
             <w:tcMar>
-              <w:top w:w="80" w:type="dxa"/>
-              <w:bottom w:w="80" w:type="dxa"/>
-              <w:left w:w="140" w:type="dxa"/>
-              <w:right w:w="140" w:type="dxa"/>
+              <w:top w:w="70" w:type="dxa"/>
+              <w:bottom w:w="70" w:type="dxa"/>
+              <w:left w:w="120" w:type="dxa"/>
+              <w:right w:w="120" w:type="dxa"/>
             </w:tcMar>
           </w:tcPr>
           <w:p>
             <w:r>
               <w:rPr>
                 <w:color w:val="334155"/>
-                <w:sz w:val="17"/>
+                <w:sz w:val="16"/>
               </w:rPr>
-              <w:t>Information Technology</w:t>
+              <w:t>Information Technology (IT)</w:t>
             </w:r>
           </w:p>
         </w:tc>
         <w:tc>
           <w:tcPr>
-            <w:tcW w:type="dxa" w:w="1728"/>
+            <w:tcW w:type="dxa" w:w="1440"/>
             <w:shd w:fill="FFFFFF"/>
             <w:tcMar>
-              <w:top w:w="80" w:type="dxa"/>
-              <w:bottom w:w="80" w:type="dxa"/>
-              <w:left w:w="140" w:type="dxa"/>
-              <w:right w:w="140" w:type="dxa"/>
+              <w:top w:w="70" w:type="dxa"/>
+              <w:bottom w:w="70" w:type="dxa"/>
+              <w:left w:w="120" w:type="dxa"/>
+              <w:right w:w="120" w:type="dxa"/>
             </w:tcMar>
           </w:tcPr>
           <w:p>
             <w:r>
               <w:rPr>
                 <w:color w:val="334155"/>
-                <w:sz w:val="17"/>
+                <w:sz w:val="16"/>
               </w:rPr>
               <w:t>210 Staff</w:t>
             </w:r>
@@ -956,20 +1215,20 @@
         </w:tc>
         <w:tc>
           <w:tcPr>
-            <w:tcW w:type="dxa" w:w="1728"/>
+            <w:tcW w:type="dxa" w:w="1440"/>
             <w:shd w:fill="FFFFFF"/>
             <w:tcMar>
-              <w:top w:w="80" w:type="dxa"/>
-              <w:bottom w:w="80" w:type="dxa"/>
-              <w:left w:w="140" w:type="dxa"/>
-              <w:right w:w="140" w:type="dxa"/>
+              <w:top w:w="70" w:type="dxa"/>
+              <w:bottom w:w="70" w:type="dxa"/>
+              <w:left w:w="120" w:type="dxa"/>
+              <w:right w:w="120" w:type="dxa"/>
             </w:tcMar>
           </w:tcPr>
           <w:p>
             <w:r>
               <w:rPr>
                 <w:color w:val="334155"/>
-                <w:sz w:val="17"/>
+                <w:sz w:val="16"/>
               </w:rPr>
               <w:t>7.00%</w:t>
             </w:r>
@@ -977,20 +1236,20 @@
         </w:tc>
         <w:tc>
           <w:tcPr>
-            <w:tcW w:type="dxa" w:w="1728"/>
+            <w:tcW w:type="dxa" w:w="1440"/>
             <w:shd w:fill="FFFFFF"/>
             <w:tcMar>
-              <w:top w:w="80" w:type="dxa"/>
-              <w:bottom w:w="80" w:type="dxa"/>
-              <w:left w:w="140" w:type="dxa"/>
-              <w:right w:w="140" w:type="dxa"/>
+              <w:top w:w="70" w:type="dxa"/>
+              <w:bottom w:w="70" w:type="dxa"/>
+              <w:left w:w="120" w:type="dxa"/>
+              <w:right w:w="120" w:type="dxa"/>
             </w:tcMar>
           </w:tcPr>
           <w:p>
             <w:r>
               <w:rPr>
                 <w:color w:val="334155"/>
-                <w:sz w:val="17"/>
+                <w:sz w:val="16"/>
               </w:rPr>
               <w:t>₹2.20 Cr</w:t>
             </w:r>
@@ -998,22 +1257,43 @@
         </w:tc>
         <w:tc>
           <w:tcPr>
-            <w:tcW w:type="dxa" w:w="1728"/>
+            <w:tcW w:type="dxa" w:w="1440"/>
             <w:shd w:fill="FFFFFF"/>
             <w:tcMar>
-              <w:top w:w="80" w:type="dxa"/>
-              <w:bottom w:w="80" w:type="dxa"/>
-              <w:left w:w="140" w:type="dxa"/>
-              <w:right w:w="140" w:type="dxa"/>
+              <w:top w:w="70" w:type="dxa"/>
+              <w:bottom w:w="70" w:type="dxa"/>
+              <w:left w:w="120" w:type="dxa"/>
+              <w:right w:w="120" w:type="dxa"/>
             </w:tcMar>
           </w:tcPr>
           <w:p>
             <w:r>
               <w:rPr>
                 <w:color w:val="334155"/>
-                <w:sz w:val="17"/>
+                <w:sz w:val="16"/>
               </w:rPr>
               <w:t>₹105,000</w:t>
+            </w:r>
+          </w:p>
+        </w:tc>
+        <w:tc>
+          <w:tcPr>
+            <w:tcW w:type="dxa" w:w="1440"/>
+            <w:shd w:fill="FFFFFF"/>
+            <w:tcMar>
+              <w:top w:w="70" w:type="dxa"/>
+              <w:bottom w:w="70" w:type="dxa"/>
+              <w:left w:w="120" w:type="dxa"/>
+              <w:right w:w="120" w:type="dxa"/>
+            </w:tcMar>
+          </w:tcPr>
+          <w:p>
+            <w:r>
+              <w:rPr>
+                <w:color w:val="334155"/>
+                <w:sz w:val="16"/>
+              </w:rPr>
+              <w:t>96.4% High</w:t>
             </w:r>
           </w:p>
         </w:tc>
@@ -1021,41 +1301,41 @@
       <w:tr>
         <w:tc>
           <w:tcPr>
-            <w:tcW w:type="dxa" w:w="1728"/>
+            <w:tcW w:type="dxa" w:w="1440"/>
             <w:shd w:fill="F8FAFC"/>
             <w:tcMar>
-              <w:top w:w="80" w:type="dxa"/>
-              <w:bottom w:w="80" w:type="dxa"/>
-              <w:left w:w="140" w:type="dxa"/>
-              <w:right w:w="140" w:type="dxa"/>
+              <w:top w:w="70" w:type="dxa"/>
+              <w:bottom w:w="70" w:type="dxa"/>
+              <w:left w:w="120" w:type="dxa"/>
+              <w:right w:w="120" w:type="dxa"/>
             </w:tcMar>
           </w:tcPr>
           <w:p>
             <w:r>
               <w:rPr>
                 <w:color w:val="334155"/>
-                <w:sz w:val="17"/>
+                <w:sz w:val="16"/>
               </w:rPr>
-              <w:t>Sales &amp; Business Dev</w:t>
+              <w:t>Sales &amp; Commercial BD</w:t>
             </w:r>
           </w:p>
         </w:tc>
         <w:tc>
           <w:tcPr>
-            <w:tcW w:type="dxa" w:w="1728"/>
+            <w:tcW w:type="dxa" w:w="1440"/>
             <w:shd w:fill="F8FAFC"/>
             <w:tcMar>
-              <w:top w:w="80" w:type="dxa"/>
-              <w:bottom w:w="80" w:type="dxa"/>
-              <w:left w:w="140" w:type="dxa"/>
-              <w:right w:w="140" w:type="dxa"/>
+              <w:top w:w="70" w:type="dxa"/>
+              <w:bottom w:w="70" w:type="dxa"/>
+              <w:left w:w="120" w:type="dxa"/>
+              <w:right w:w="120" w:type="dxa"/>
             </w:tcMar>
           </w:tcPr>
           <w:p>
             <w:r>
               <w:rPr>
                 <w:color w:val="334155"/>
-                <w:sz w:val="17"/>
+                <w:sz w:val="16"/>
               </w:rPr>
               <w:t>180 Staff</w:t>
             </w:r>
@@ -1063,20 +1343,20 @@
         </w:tc>
         <w:tc>
           <w:tcPr>
-            <w:tcW w:type="dxa" w:w="1728"/>
+            <w:tcW w:type="dxa" w:w="1440"/>
             <w:shd w:fill="F8FAFC"/>
             <w:tcMar>
-              <w:top w:w="80" w:type="dxa"/>
-              <w:bottom w:w="80" w:type="dxa"/>
-              <w:left w:w="140" w:type="dxa"/>
-              <w:right w:w="140" w:type="dxa"/>
+              <w:top w:w="70" w:type="dxa"/>
+              <w:bottom w:w="70" w:type="dxa"/>
+              <w:left w:w="120" w:type="dxa"/>
+              <w:right w:w="120" w:type="dxa"/>
             </w:tcMar>
           </w:tcPr>
           <w:p>
             <w:r>
               <w:rPr>
                 <w:color w:val="334155"/>
-                <w:sz w:val="17"/>
+                <w:sz w:val="16"/>
               </w:rPr>
               <w:t>6.00%</w:t>
             </w:r>
@@ -1084,20 +1364,20 @@
         </w:tc>
         <w:tc>
           <w:tcPr>
-            <w:tcW w:type="dxa" w:w="1728"/>
+            <w:tcW w:type="dxa" w:w="1440"/>
             <w:shd w:fill="F8FAFC"/>
             <w:tcMar>
-              <w:top w:w="80" w:type="dxa"/>
-              <w:bottom w:w="80" w:type="dxa"/>
-              <w:left w:w="140" w:type="dxa"/>
-              <w:right w:w="140" w:type="dxa"/>
+              <w:top w:w="70" w:type="dxa"/>
+              <w:bottom w:w="70" w:type="dxa"/>
+              <w:left w:w="120" w:type="dxa"/>
+              <w:right w:w="120" w:type="dxa"/>
             </w:tcMar>
           </w:tcPr>
           <w:p>
             <w:r>
               <w:rPr>
                 <w:color w:val="334155"/>
-                <w:sz w:val="17"/>
+                <w:sz w:val="16"/>
               </w:rPr>
               <w:t>₹1.53 Cr</w:t>
             </w:r>
@@ -1105,22 +1385,43 @@
         </w:tc>
         <w:tc>
           <w:tcPr>
-            <w:tcW w:type="dxa" w:w="1728"/>
+            <w:tcW w:type="dxa" w:w="1440"/>
             <w:shd w:fill="F8FAFC"/>
             <w:tcMar>
-              <w:top w:w="80" w:type="dxa"/>
-              <w:bottom w:w="80" w:type="dxa"/>
-              <w:left w:w="140" w:type="dxa"/>
-              <w:right w:w="140" w:type="dxa"/>
+              <w:top w:w="70" w:type="dxa"/>
+              <w:bottom w:w="70" w:type="dxa"/>
+              <w:left w:w="120" w:type="dxa"/>
+              <w:right w:w="120" w:type="dxa"/>
             </w:tcMar>
           </w:tcPr>
           <w:p>
             <w:r>
               <w:rPr>
                 <w:color w:val="334155"/>
-                <w:sz w:val="17"/>
+                <w:sz w:val="16"/>
               </w:rPr>
               <w:t>₹85,000</w:t>
+            </w:r>
+          </w:p>
+        </w:tc>
+        <w:tc>
+          <w:tcPr>
+            <w:tcW w:type="dxa" w:w="1440"/>
+            <w:shd w:fill="F8FAFC"/>
+            <w:tcMar>
+              <w:top w:w="70" w:type="dxa"/>
+              <w:bottom w:w="70" w:type="dxa"/>
+              <w:left w:w="120" w:type="dxa"/>
+              <w:right w:w="120" w:type="dxa"/>
+            </w:tcMar>
+          </w:tcPr>
+          <w:p>
+            <w:r>
+              <w:rPr>
+                <w:color w:val="334155"/>
+                <w:sz w:val="16"/>
+              </w:rPr>
+              <w:t>93.8% Normal</w:t>
             </w:r>
           </w:p>
         </w:tc>
@@ -1128,41 +1429,41 @@
       <w:tr>
         <w:tc>
           <w:tcPr>
-            <w:tcW w:type="dxa" w:w="1728"/>
+            <w:tcW w:type="dxa" w:w="1440"/>
             <w:shd w:fill="FFFFFF"/>
             <w:tcMar>
-              <w:top w:w="80" w:type="dxa"/>
-              <w:bottom w:w="80" w:type="dxa"/>
-              <w:left w:w="140" w:type="dxa"/>
-              <w:right w:w="140" w:type="dxa"/>
+              <w:top w:w="70" w:type="dxa"/>
+              <w:bottom w:w="70" w:type="dxa"/>
+              <w:left w:w="120" w:type="dxa"/>
+              <w:right w:w="120" w:type="dxa"/>
             </w:tcMar>
           </w:tcPr>
           <w:p>
             <w:r>
               <w:rPr>
                 <w:color w:val="334155"/>
-                <w:sz w:val="17"/>
+                <w:sz w:val="16"/>
               </w:rPr>
-              <w:t>Finance &amp; Accounting</w:t>
+              <w:t>Finance &amp; Treasury</w:t>
             </w:r>
           </w:p>
         </w:tc>
         <w:tc>
           <w:tcPr>
-            <w:tcW w:type="dxa" w:w="1728"/>
+            <w:tcW w:type="dxa" w:w="1440"/>
             <w:shd w:fill="FFFFFF"/>
             <w:tcMar>
-              <w:top w:w="80" w:type="dxa"/>
-              <w:bottom w:w="80" w:type="dxa"/>
-              <w:left w:w="140" w:type="dxa"/>
-              <w:right w:w="140" w:type="dxa"/>
+              <w:top w:w="70" w:type="dxa"/>
+              <w:bottom w:w="70" w:type="dxa"/>
+              <w:left w:w="120" w:type="dxa"/>
+              <w:right w:w="120" w:type="dxa"/>
             </w:tcMar>
           </w:tcPr>
           <w:p>
             <w:r>
               <w:rPr>
                 <w:color w:val="334155"/>
-                <w:sz w:val="17"/>
+                <w:sz w:val="16"/>
               </w:rPr>
               <w:t>95 Staff</w:t>
             </w:r>
@@ -1170,20 +1471,20 @@
         </w:tc>
         <w:tc>
           <w:tcPr>
-            <w:tcW w:type="dxa" w:w="1728"/>
+            <w:tcW w:type="dxa" w:w="1440"/>
             <w:shd w:fill="FFFFFF"/>
             <w:tcMar>
-              <w:top w:w="80" w:type="dxa"/>
-              <w:bottom w:w="80" w:type="dxa"/>
-              <w:left w:w="140" w:type="dxa"/>
-              <w:right w:w="140" w:type="dxa"/>
+              <w:top w:w="70" w:type="dxa"/>
+              <w:bottom w:w="70" w:type="dxa"/>
+              <w:left w:w="120" w:type="dxa"/>
+              <w:right w:w="120" w:type="dxa"/>
             </w:tcMar>
           </w:tcPr>
           <w:p>
             <w:r>
               <w:rPr>
                 <w:color w:val="334155"/>
-                <w:sz w:val="17"/>
+                <w:sz w:val="16"/>
               </w:rPr>
               <w:t>3.17%</w:t>
             </w:r>
@@ -1191,20 +1492,20 @@
         </w:tc>
         <w:tc>
           <w:tcPr>
-            <w:tcW w:type="dxa" w:w="1728"/>
+            <w:tcW w:type="dxa" w:w="1440"/>
             <w:shd w:fill="FFFFFF"/>
             <w:tcMar>
-              <w:top w:w="80" w:type="dxa"/>
-              <w:bottom w:w="80" w:type="dxa"/>
-              <w:left w:w="140" w:type="dxa"/>
-              <w:right w:w="140" w:type="dxa"/>
+              <w:top w:w="70" w:type="dxa"/>
+              <w:bottom w:w="70" w:type="dxa"/>
+              <w:left w:w="120" w:type="dxa"/>
+              <w:right w:w="120" w:type="dxa"/>
             </w:tcMar>
           </w:tcPr>
           <w:p>
             <w:r>
               <w:rPr>
                 <w:color w:val="334155"/>
-                <w:sz w:val="17"/>
+                <w:sz w:val="16"/>
               </w:rPr>
               <w:t>₹0.90 Cr</w:t>
             </w:r>
@@ -1212,22 +1513,43 @@
         </w:tc>
         <w:tc>
           <w:tcPr>
-            <w:tcW w:type="dxa" w:w="1728"/>
+            <w:tcW w:type="dxa" w:w="1440"/>
             <w:shd w:fill="FFFFFF"/>
             <w:tcMar>
-              <w:top w:w="80" w:type="dxa"/>
-              <w:bottom w:w="80" w:type="dxa"/>
-              <w:left w:w="140" w:type="dxa"/>
-              <w:right w:w="140" w:type="dxa"/>
+              <w:top w:w="70" w:type="dxa"/>
+              <w:bottom w:w="70" w:type="dxa"/>
+              <w:left w:w="120" w:type="dxa"/>
+              <w:right w:w="120" w:type="dxa"/>
             </w:tcMar>
           </w:tcPr>
           <w:p>
             <w:r>
               <w:rPr>
                 <w:color w:val="334155"/>
-                <w:sz w:val="17"/>
+                <w:sz w:val="16"/>
               </w:rPr>
               <w:t>₹95,000</w:t>
+            </w:r>
+          </w:p>
+        </w:tc>
+        <w:tc>
+          <w:tcPr>
+            <w:tcW w:type="dxa" w:w="1440"/>
+            <w:shd w:fill="FFFFFF"/>
+            <w:tcMar>
+              <w:top w:w="70" w:type="dxa"/>
+              <w:bottom w:w="70" w:type="dxa"/>
+              <w:left w:w="120" w:type="dxa"/>
+              <w:right w:w="120" w:type="dxa"/>
+            </w:tcMar>
+          </w:tcPr>
+          <w:p>
+            <w:r>
+              <w:rPr>
+                <w:color w:val="334155"/>
+                <w:sz w:val="16"/>
+              </w:rPr>
+              <w:t>97.1% High</w:t>
             </w:r>
           </w:p>
         </w:tc>
@@ -1235,20 +1557,20 @@
       <w:tr>
         <w:tc>
           <w:tcPr>
-            <w:tcW w:type="dxa" w:w="1728"/>
+            <w:tcW w:type="dxa" w:w="1440"/>
             <w:shd w:fill="F8FAFC"/>
             <w:tcMar>
-              <w:top w:w="80" w:type="dxa"/>
-              <w:bottom w:w="80" w:type="dxa"/>
-              <w:left w:w="140" w:type="dxa"/>
-              <w:right w:w="140" w:type="dxa"/>
+              <w:top w:w="70" w:type="dxa"/>
+              <w:bottom w:w="70" w:type="dxa"/>
+              <w:left w:w="120" w:type="dxa"/>
+              <w:right w:w="120" w:type="dxa"/>
             </w:tcMar>
           </w:tcPr>
           <w:p>
             <w:r>
               <w:rPr>
                 <w:color w:val="334155"/>
-                <w:sz w:val="17"/>
+                <w:sz w:val="16"/>
               </w:rPr>
               <w:t>Marketing &amp; Growth</w:t>
             </w:r>
@@ -1256,20 +1578,20 @@
         </w:tc>
         <w:tc>
           <w:tcPr>
-            <w:tcW w:type="dxa" w:w="1728"/>
+            <w:tcW w:type="dxa" w:w="1440"/>
             <w:shd w:fill="F8FAFC"/>
             <w:tcMar>
-              <w:top w:w="80" w:type="dxa"/>
-              <w:bottom w:w="80" w:type="dxa"/>
-              <w:left w:w="140" w:type="dxa"/>
-              <w:right w:w="140" w:type="dxa"/>
+              <w:top w:w="70" w:type="dxa"/>
+              <w:bottom w:w="70" w:type="dxa"/>
+              <w:left w:w="120" w:type="dxa"/>
+              <w:right w:w="120" w:type="dxa"/>
             </w:tcMar>
           </w:tcPr>
           <w:p>
             <w:r>
               <w:rPr>
                 <w:color w:val="334155"/>
-                <w:sz w:val="17"/>
+                <w:sz w:val="16"/>
               </w:rPr>
               <w:t>85 Staff</w:t>
             </w:r>
@@ -1277,20 +1599,20 @@
         </w:tc>
         <w:tc>
           <w:tcPr>
-            <w:tcW w:type="dxa" w:w="1728"/>
+            <w:tcW w:type="dxa" w:w="1440"/>
             <w:shd w:fill="F8FAFC"/>
             <w:tcMar>
-              <w:top w:w="80" w:type="dxa"/>
-              <w:bottom w:w="80" w:type="dxa"/>
-              <w:left w:w="140" w:type="dxa"/>
-              <w:right w:w="140" w:type="dxa"/>
+              <w:top w:w="70" w:type="dxa"/>
+              <w:bottom w:w="70" w:type="dxa"/>
+              <w:left w:w="120" w:type="dxa"/>
+              <w:right w:w="120" w:type="dxa"/>
             </w:tcMar>
           </w:tcPr>
           <w:p>
             <w:r>
               <w:rPr>
                 <w:color w:val="334155"/>
-                <w:sz w:val="17"/>
+                <w:sz w:val="16"/>
               </w:rPr>
               <w:t>2.83%</w:t>
             </w:r>
@@ -1298,20 +1620,20 @@
         </w:tc>
         <w:tc>
           <w:tcPr>
-            <w:tcW w:type="dxa" w:w="1728"/>
+            <w:tcW w:type="dxa" w:w="1440"/>
             <w:shd w:fill="F8FAFC"/>
             <w:tcMar>
-              <w:top w:w="80" w:type="dxa"/>
-              <w:bottom w:w="80" w:type="dxa"/>
-              <w:left w:w="140" w:type="dxa"/>
-              <w:right w:w="140" w:type="dxa"/>
+              <w:top w:w="70" w:type="dxa"/>
+              <w:bottom w:w="70" w:type="dxa"/>
+              <w:left w:w="120" w:type="dxa"/>
+              <w:right w:w="120" w:type="dxa"/>
             </w:tcMar>
           </w:tcPr>
           <w:p>
             <w:r>
               <w:rPr>
                 <w:color w:val="334155"/>
-                <w:sz w:val="17"/>
+                <w:sz w:val="16"/>
               </w:rPr>
               <w:t>₹0.85 Cr</w:t>
             </w:r>
@@ -1319,22 +1641,43 @@
         </w:tc>
         <w:tc>
           <w:tcPr>
-            <w:tcW w:type="dxa" w:w="1728"/>
+            <w:tcW w:type="dxa" w:w="1440"/>
             <w:shd w:fill="F8FAFC"/>
             <w:tcMar>
-              <w:top w:w="80" w:type="dxa"/>
-              <w:bottom w:w="80" w:type="dxa"/>
-              <w:left w:w="140" w:type="dxa"/>
-              <w:right w:w="140" w:type="dxa"/>
+              <w:top w:w="70" w:type="dxa"/>
+              <w:bottom w:w="70" w:type="dxa"/>
+              <w:left w:w="120" w:type="dxa"/>
+              <w:right w:w="120" w:type="dxa"/>
             </w:tcMar>
           </w:tcPr>
           <w:p>
             <w:r>
               <w:rPr>
                 <w:color w:val="334155"/>
-                <w:sz w:val="17"/>
+                <w:sz w:val="16"/>
               </w:rPr>
               <w:t>₹100,000</w:t>
+            </w:r>
+          </w:p>
+        </w:tc>
+        <w:tc>
+          <w:tcPr>
+            <w:tcW w:type="dxa" w:w="1440"/>
+            <w:shd w:fill="F8FAFC"/>
+            <w:tcMar>
+              <w:top w:w="70" w:type="dxa"/>
+              <w:bottom w:w="70" w:type="dxa"/>
+              <w:left w:w="120" w:type="dxa"/>
+              <w:right w:w="120" w:type="dxa"/>
+            </w:tcMar>
+          </w:tcPr>
+          <w:p>
+            <w:r>
+              <w:rPr>
+                <w:color w:val="334155"/>
+                <w:sz w:val="16"/>
+              </w:rPr>
+              <w:t>95.0% High</w:t>
             </w:r>
           </w:p>
         </w:tc>
@@ -1342,41 +1685,41 @@
       <w:tr>
         <w:tc>
           <w:tcPr>
-            <w:tcW w:type="dxa" w:w="1728"/>
+            <w:tcW w:type="dxa" w:w="1440"/>
             <w:shd w:fill="FFFFFF"/>
             <w:tcMar>
-              <w:top w:w="80" w:type="dxa"/>
-              <w:bottom w:w="80" w:type="dxa"/>
-              <w:left w:w="140" w:type="dxa"/>
-              <w:right w:w="140" w:type="dxa"/>
+              <w:top w:w="70" w:type="dxa"/>
+              <w:bottom w:w="70" w:type="dxa"/>
+              <w:left w:w="120" w:type="dxa"/>
+              <w:right w:w="120" w:type="dxa"/>
             </w:tcMar>
           </w:tcPr>
           <w:p>
             <w:r>
               <w:rPr>
                 <w:color w:val="334155"/>
-                <w:sz w:val="17"/>
+                <w:sz w:val="16"/>
               </w:rPr>
-              <w:t>Human Resources</w:t>
+              <w:t>Human Resources &amp; Talent</w:t>
             </w:r>
           </w:p>
         </w:tc>
         <w:tc>
           <w:tcPr>
-            <w:tcW w:type="dxa" w:w="1728"/>
+            <w:tcW w:type="dxa" w:w="1440"/>
             <w:shd w:fill="FFFFFF"/>
             <w:tcMar>
-              <w:top w:w="80" w:type="dxa"/>
-              <w:bottom w:w="80" w:type="dxa"/>
-              <w:left w:w="140" w:type="dxa"/>
-              <w:right w:w="140" w:type="dxa"/>
+              <w:top w:w="70" w:type="dxa"/>
+              <w:bottom w:w="70" w:type="dxa"/>
+              <w:left w:w="120" w:type="dxa"/>
+              <w:right w:w="120" w:type="dxa"/>
             </w:tcMar>
           </w:tcPr>
           <w:p>
             <w:r>
               <w:rPr>
                 <w:color w:val="334155"/>
-                <w:sz w:val="17"/>
+                <w:sz w:val="16"/>
               </w:rPr>
               <w:t>60 Staff</w:t>
             </w:r>
@@ -1384,20 +1727,20 @@
         </w:tc>
         <w:tc>
           <w:tcPr>
-            <w:tcW w:type="dxa" w:w="1728"/>
+            <w:tcW w:type="dxa" w:w="1440"/>
             <w:shd w:fill="FFFFFF"/>
             <w:tcMar>
-              <w:top w:w="80" w:type="dxa"/>
-              <w:bottom w:w="80" w:type="dxa"/>
-              <w:left w:w="140" w:type="dxa"/>
-              <w:right w:w="140" w:type="dxa"/>
+              <w:top w:w="70" w:type="dxa"/>
+              <w:bottom w:w="70" w:type="dxa"/>
+              <w:left w:w="120" w:type="dxa"/>
+              <w:right w:w="120" w:type="dxa"/>
             </w:tcMar>
           </w:tcPr>
           <w:p>
             <w:r>
               <w:rPr>
                 <w:color w:val="334155"/>
-                <w:sz w:val="17"/>
+                <w:sz w:val="16"/>
               </w:rPr>
               <w:t>2.00%</w:t>
             </w:r>
@@ -1405,20 +1748,20 @@
         </w:tc>
         <w:tc>
           <w:tcPr>
-            <w:tcW w:type="dxa" w:w="1728"/>
+            <w:tcW w:type="dxa" w:w="1440"/>
             <w:shd w:fill="FFFFFF"/>
             <w:tcMar>
-              <w:top w:w="80" w:type="dxa"/>
-              <w:bottom w:w="80" w:type="dxa"/>
-              <w:left w:w="140" w:type="dxa"/>
-              <w:right w:w="140" w:type="dxa"/>
+              <w:top w:w="70" w:type="dxa"/>
+              <w:bottom w:w="70" w:type="dxa"/>
+              <w:left w:w="120" w:type="dxa"/>
+              <w:right w:w="120" w:type="dxa"/>
             </w:tcMar>
           </w:tcPr>
           <w:p>
             <w:r>
               <w:rPr>
                 <w:color w:val="334155"/>
-                <w:sz w:val="17"/>
+                <w:sz w:val="16"/>
               </w:rPr>
               <w:t>₹0.57 Cr</w:t>
             </w:r>
@@ -1426,22 +1769,43 @@
         </w:tc>
         <w:tc>
           <w:tcPr>
-            <w:tcW w:type="dxa" w:w="1728"/>
+            <w:tcW w:type="dxa" w:w="1440"/>
             <w:shd w:fill="FFFFFF"/>
             <w:tcMar>
-              <w:top w:w="80" w:type="dxa"/>
-              <w:bottom w:w="80" w:type="dxa"/>
-              <w:left w:w="140" w:type="dxa"/>
-              <w:right w:w="140" w:type="dxa"/>
+              <w:top w:w="70" w:type="dxa"/>
+              <w:bottom w:w="70" w:type="dxa"/>
+              <w:left w:w="120" w:type="dxa"/>
+              <w:right w:w="120" w:type="dxa"/>
             </w:tcMar>
           </w:tcPr>
           <w:p>
             <w:r>
               <w:rPr>
                 <w:color w:val="334155"/>
-                <w:sz w:val="17"/>
+                <w:sz w:val="16"/>
               </w:rPr>
               <w:t>₹95,000</w:t>
+            </w:r>
+          </w:p>
+        </w:tc>
+        <w:tc>
+          <w:tcPr>
+            <w:tcW w:type="dxa" w:w="1440"/>
+            <w:shd w:fill="FFFFFF"/>
+            <w:tcMar>
+              <w:top w:w="70" w:type="dxa"/>
+              <w:bottom w:w="70" w:type="dxa"/>
+              <w:left w:w="120" w:type="dxa"/>
+              <w:right w:w="120" w:type="dxa"/>
+            </w:tcMar>
+          </w:tcPr>
+          <w:p>
+            <w:r>
+              <w:rPr>
+                <w:color w:val="334155"/>
+                <w:sz w:val="16"/>
+              </w:rPr>
+              <w:t>98.2% Exemplary</w:t>
             </w:r>
           </w:p>
         </w:tc>
@@ -1449,106 +1813,255 @@
       <w:tr>
         <w:tc>
           <w:tcPr>
-            <w:tcW w:type="dxa" w:w="1728"/>
+            <w:tcW w:type="dxa" w:w="1440"/>
             <w:shd w:fill="F8FAFC"/>
             <w:tcMar>
-              <w:top w:w="80" w:type="dxa"/>
-              <w:bottom w:w="80" w:type="dxa"/>
-              <w:left w:w="140" w:type="dxa"/>
-              <w:right w:w="140" w:type="dxa"/>
+              <w:top w:w="70" w:type="dxa"/>
+              <w:bottom w:w="70" w:type="dxa"/>
+              <w:left w:w="120" w:type="dxa"/>
+              <w:right w:w="120" w:type="dxa"/>
             </w:tcMar>
           </w:tcPr>
           <w:p>
             <w:r>
               <w:rPr>
                 <w:color w:val="334155"/>
-                <w:sz w:val="17"/>
+                <w:sz w:val="16"/>
               </w:rPr>
-              <w:t>Corporate &amp; Admin</w:t>
+              <w:t>General Day Shift Roster</w:t>
             </w:r>
           </w:p>
         </w:tc>
         <w:tc>
           <w:tcPr>
-            <w:tcW w:type="dxa" w:w="1728"/>
+            <w:tcW w:type="dxa" w:w="1440"/>
             <w:shd w:fill="F8FAFC"/>
             <w:tcMar>
-              <w:top w:w="80" w:type="dxa"/>
-              <w:bottom w:w="80" w:type="dxa"/>
-              <w:left w:w="140" w:type="dxa"/>
-              <w:right w:w="140" w:type="dxa"/>
+              <w:top w:w="70" w:type="dxa"/>
+              <w:bottom w:w="70" w:type="dxa"/>
+              <w:left w:w="120" w:type="dxa"/>
+              <w:right w:w="120" w:type="dxa"/>
             </w:tcMar>
           </w:tcPr>
           <w:p>
             <w:r>
               <w:rPr>
                 <w:color w:val="334155"/>
-                <w:sz w:val="17"/>
+                <w:sz w:val="16"/>
               </w:rPr>
-              <w:t>100 Staff</w:t>
+              <w:t>1,275 Staff</w:t>
             </w:r>
           </w:p>
         </w:tc>
         <w:tc>
           <w:tcPr>
-            <w:tcW w:type="dxa" w:w="1728"/>
+            <w:tcW w:type="dxa" w:w="1440"/>
             <w:shd w:fill="F8FAFC"/>
             <w:tcMar>
-              <w:top w:w="80" w:type="dxa"/>
-              <w:bottom w:w="80" w:type="dxa"/>
-              <w:left w:w="140" w:type="dxa"/>
-              <w:right w:w="140" w:type="dxa"/>
+              <w:top w:w="70" w:type="dxa"/>
+              <w:bottom w:w="70" w:type="dxa"/>
+              <w:left w:w="120" w:type="dxa"/>
+              <w:right w:w="120" w:type="dxa"/>
             </w:tcMar>
           </w:tcPr>
           <w:p>
             <w:r>
               <w:rPr>
                 <w:color w:val="334155"/>
-                <w:sz w:val="17"/>
+                <w:sz w:val="16"/>
               </w:rPr>
-              <w:t>3.33%</w:t>
+              <w:t>42.50%</w:t>
             </w:r>
           </w:p>
         </w:tc>
         <w:tc>
           <w:tcPr>
-            <w:tcW w:type="dxa" w:w="1728"/>
+            <w:tcW w:type="dxa" w:w="1440"/>
             <w:shd w:fill="F8FAFC"/>
             <w:tcMar>
-              <w:top w:w="80" w:type="dxa"/>
-              <w:bottom w:w="80" w:type="dxa"/>
-              <w:left w:w="140" w:type="dxa"/>
-              <w:right w:w="140" w:type="dxa"/>
+              <w:top w:w="70" w:type="dxa"/>
+              <w:bottom w:w="70" w:type="dxa"/>
+              <w:left w:w="120" w:type="dxa"/>
+              <w:right w:w="120" w:type="dxa"/>
             </w:tcMar>
           </w:tcPr>
           <w:p>
             <w:r>
               <w:rPr>
                 <w:color w:val="334155"/>
-                <w:sz w:val="17"/>
+                <w:sz w:val="16"/>
               </w:rPr>
-              <w:t>₹0.95 Cr</w:t>
+              <w:t>₹8.07 Cr</w:t>
             </w:r>
           </w:p>
         </w:tc>
         <w:tc>
           <w:tcPr>
-            <w:tcW w:type="dxa" w:w="1728"/>
+            <w:tcW w:type="dxa" w:w="1440"/>
             <w:shd w:fill="F8FAFC"/>
             <w:tcMar>
-              <w:top w:w="80" w:type="dxa"/>
-              <w:bottom w:w="80" w:type="dxa"/>
-              <w:left w:w="140" w:type="dxa"/>
-              <w:right w:w="140" w:type="dxa"/>
+              <w:top w:w="70" w:type="dxa"/>
+              <w:bottom w:w="70" w:type="dxa"/>
+              <w:left w:w="120" w:type="dxa"/>
+              <w:right w:w="120" w:type="dxa"/>
             </w:tcMar>
           </w:tcPr>
           <w:p>
             <w:r>
               <w:rPr>
                 <w:color w:val="334155"/>
-                <w:sz w:val="17"/>
+                <w:sz w:val="16"/>
               </w:rPr>
-              <w:t>₹95,000</w:t>
+              <w:t>₹63,267</w:t>
+            </w:r>
+          </w:p>
+        </w:tc>
+        <w:tc>
+          <w:tcPr>
+            <w:tcW w:type="dxa" w:w="1440"/>
+            <w:shd w:fill="F8FAFC"/>
+            <w:tcMar>
+              <w:top w:w="70" w:type="dxa"/>
+              <w:bottom w:w="70" w:type="dxa"/>
+              <w:left w:w="120" w:type="dxa"/>
+              <w:right w:w="120" w:type="dxa"/>
+            </w:tcMar>
+          </w:tcPr>
+          <w:p>
+            <w:r>
+              <w:rPr>
+                <w:color w:val="334155"/>
+                <w:sz w:val="16"/>
+              </w:rPr>
+              <w:t>95.5% Core Staff</w:t>
+            </w:r>
+          </w:p>
+        </w:tc>
+      </w:tr>
+      <w:tr>
+        <w:tc>
+          <w:tcPr>
+            <w:tcW w:type="dxa" w:w="1440"/>
+            <w:shd w:fill="FFFFFF"/>
+            <w:tcMar>
+              <w:top w:w="70" w:type="dxa"/>
+              <w:bottom w:w="70" w:type="dxa"/>
+              <w:left w:w="120" w:type="dxa"/>
+              <w:right w:w="120" w:type="dxa"/>
+            </w:tcMar>
+          </w:tcPr>
+          <w:p>
+            <w:r>
+              <w:rPr>
+                <w:color w:val="334155"/>
+                <w:sz w:val="16"/>
+              </w:rPr>
+              <w:t>Night Production Shift</w:t>
+            </w:r>
+          </w:p>
+        </w:tc>
+        <w:tc>
+          <w:tcPr>
+            <w:tcW w:type="dxa" w:w="1440"/>
+            <w:shd w:fill="FFFFFF"/>
+            <w:tcMar>
+              <w:top w:w="70" w:type="dxa"/>
+              <w:bottom w:w="70" w:type="dxa"/>
+              <w:left w:w="120" w:type="dxa"/>
+              <w:right w:w="120" w:type="dxa"/>
+            </w:tcMar>
+          </w:tcPr>
+          <w:p>
+            <w:r>
+              <w:rPr>
+                <w:color w:val="334155"/>
+                <w:sz w:val="16"/>
+              </w:rPr>
+              <w:t>315 Staff</w:t>
+            </w:r>
+          </w:p>
+        </w:tc>
+        <w:tc>
+          <w:tcPr>
+            <w:tcW w:type="dxa" w:w="1440"/>
+            <w:shd w:fill="FFFFFF"/>
+            <w:tcMar>
+              <w:top w:w="70" w:type="dxa"/>
+              <w:bottom w:w="70" w:type="dxa"/>
+              <w:left w:w="120" w:type="dxa"/>
+              <w:right w:w="120" w:type="dxa"/>
+            </w:tcMar>
+          </w:tcPr>
+          <w:p>
+            <w:r>
+              <w:rPr>
+                <w:color w:val="334155"/>
+                <w:sz w:val="16"/>
+              </w:rPr>
+              <w:t>10.50%</w:t>
+            </w:r>
+          </w:p>
+        </w:tc>
+        <w:tc>
+          <w:tcPr>
+            <w:tcW w:type="dxa" w:w="1440"/>
+            <w:shd w:fill="FFFFFF"/>
+            <w:tcMar>
+              <w:top w:w="70" w:type="dxa"/>
+              <w:bottom w:w="70" w:type="dxa"/>
+              <w:left w:w="120" w:type="dxa"/>
+              <w:right w:w="120" w:type="dxa"/>
+            </w:tcMar>
+          </w:tcPr>
+          <w:p>
+            <w:r>
+              <w:rPr>
+                <w:color w:val="334155"/>
+                <w:sz w:val="16"/>
+              </w:rPr>
+              <w:t>₹2.00 Cr</w:t>
+            </w:r>
+          </w:p>
+        </w:tc>
+        <w:tc>
+          <w:tcPr>
+            <w:tcW w:type="dxa" w:w="1440"/>
+            <w:shd w:fill="FFFFFF"/>
+            <w:tcMar>
+              <w:top w:w="70" w:type="dxa"/>
+              <w:bottom w:w="70" w:type="dxa"/>
+              <w:left w:w="120" w:type="dxa"/>
+              <w:right w:w="120" w:type="dxa"/>
+            </w:tcMar>
+          </w:tcPr>
+          <w:p>
+            <w:r>
+              <w:rPr>
+                <w:color w:val="334155"/>
+                <w:sz w:val="16"/>
+              </w:rPr>
+              <w:t>₹63,267</w:t>
+            </w:r>
+          </w:p>
+        </w:tc>
+        <w:tc>
+          <w:tcPr>
+            <w:tcW w:type="dxa" w:w="1440"/>
+            <w:shd w:fill="FFFFFF"/>
+            <w:tcMar>
+              <w:top w:w="70" w:type="dxa"/>
+              <w:bottom w:w="70" w:type="dxa"/>
+              <w:left w:w="120" w:type="dxa"/>
+              <w:right w:w="120" w:type="dxa"/>
+            </w:tcMar>
+          </w:tcPr>
+          <w:p>
+            <w:r>
+              <w:rPr>
+                <w:color w:val="334155"/>
+                <w:sz w:val="16"/>
+              </w:rPr>
+              <w:t>92.1% Monitored</w:t>
             </w:r>
           </w:p>
         </w:tc>
@@ -1556,7 +2069,7 @@
     </w:tbl>
     <w:p>
       <w:pPr>
-        <w:spacing w:after="200"/>
+        <w:spacing w:after="160"/>
       </w:pPr>
     </w:p>
     <w:p>
@@ -1567,14 +2080,75 @@
         <w:rPr>
           <w:b/>
           <w:color w:val="1E293B"/>
-          <w:sz w:val="28"/>
+          <w:sz w:val="26"/>
         </w:rPr>
-        <w:t>2. Financial OPEX Waterfall &amp; Operating Expense Structure</w:t>
+        <w:t>2. Financial Governance Domain: OPEX Waterfall, Settlement Rails &amp; Corporate Expenses</w:t>
       </w:r>
     </w:p>
     <w:p>
       <w:r>
-        <w:t>Analysis of corporate administrative expenditure vs branch store operating burn rate.</w:t>
+        <w:t>Operating outflows vs revenue waterfall, payment tender settlement dynamics, top 8 corporate expenditures, and category margins.</w:t>
+      </w:r>
+    </w:p>
+    <w:p>
+      <w:r>
+        <w:t>Associated Domain Visualizations in Dashboard:</w:t>
+      </w:r>
+    </w:p>
+    <w:p>
+      <w:pPr>
+        <w:pStyle w:val="ListBullet"/>
+      </w:pPr>
+      <w:r>
+        <w:rPr>
+          <w:b/>
+        </w:rPr>
+        <w:t xml:space="preserve">Chart 1 (Waterfall Bar): </w:t>
+      </w:r>
+      <w:r>
+        <w:t>Financial Health Outflows vs Gross Margin (Revenue ₹676.95 Cr, COGS -₹490.86 Cr, Gross Margin ₹186.10 Cr, Store OPEX -₹10.04 Cr, Corp OPEX -₹801.50 Cr, Spread -₹134.59 Cr)</w:t>
+      </w:r>
+    </w:p>
+    <w:p>
+      <w:pPr>
+        <w:pStyle w:val="ListBullet"/>
+      </w:pPr>
+      <w:r>
+        <w:rPr>
+          <w:b/>
+        </w:rPr>
+        <w:t xml:space="preserve">Chart 2 (Donut): </w:t>
+      </w:r>
+      <w:r>
+        <w:t>Payment Settlement Rails Breakdown (UPI ₹312.4 Cr, Credit/Debit Cards ₹241.1 Cr, Net Banking ₹92.5 Cr, COD ₹55.2 Cr)</w:t>
+      </w:r>
+    </w:p>
+    <w:p>
+      <w:pPr>
+        <w:pStyle w:val="ListBullet"/>
+      </w:pPr>
+      <w:r>
+        <w:rPr>
+          <w:b/>
+        </w:rPr>
+        <w:t xml:space="preserve">Chart 3 (Horizontal Bar): </w:t>
+      </w:r>
+      <w:r>
+        <w:t>Top 8 Corporate Expense Categories (Rent ₹108.5 Cr, Marketing ₹85.2 Cr, Software ₹64.1 Cr, Utilities ₹58.9 Cr, Freight ₹52.4 Cr, Insurance ₹45.1 Cr, Taxes ₹38.6 Cr, Maintenance ₹32.8 Cr)</w:t>
+      </w:r>
+    </w:p>
+    <w:p>
+      <w:pPr>
+        <w:pStyle w:val="ListBullet"/>
+      </w:pPr>
+      <w:r>
+        <w:rPr>
+          <w:b/>
+        </w:rPr>
+        <w:t xml:space="preserve">Chart 4 (Combo Line/Column): </w:t>
+      </w:r>
+      <w:r>
+        <w:t>Product Category Delivered Sales vs Realized Gross Margin %</w:t>
       </w:r>
     </w:p>
     <w:tbl>
@@ -1585,22 +2159,23 @@
         <w:tblLook w:firstColumn="1" w:firstRow="1" w:lastColumn="0" w:lastRow="0" w:noHBand="0" w:noVBand="1" w:val="04A0"/>
       </w:tblPr>
       <w:tblGrid>
-        <w:gridCol w:w="1728"/>
-        <w:gridCol w:w="1728"/>
-        <w:gridCol w:w="1728"/>
-        <w:gridCol w:w="1728"/>
-        <w:gridCol w:w="1728"/>
+        <w:gridCol w:w="1440"/>
+        <w:gridCol w:w="1440"/>
+        <w:gridCol w:w="1440"/>
+        <w:gridCol w:w="1440"/>
+        <w:gridCol w:w="1440"/>
+        <w:gridCol w:w="1440"/>
       </w:tblGrid>
       <w:tr>
         <w:tc>
           <w:tcPr>
-            <w:tcW w:type="dxa" w:w="1728"/>
+            <w:tcW w:type="dxa" w:w="1440"/>
             <w:shd w:fill="0F172A"/>
             <w:tcMar>
-              <w:top w:w="120" w:type="dxa"/>
-              <w:bottom w:w="120" w:type="dxa"/>
-              <w:left w:w="140" w:type="dxa"/>
-              <w:right w:w="140" w:type="dxa"/>
+              <w:top w:w="100" w:type="dxa"/>
+              <w:bottom w:w="100" w:type="dxa"/>
+              <w:left w:w="120" w:type="dxa"/>
+              <w:right w:w="120" w:type="dxa"/>
             </w:tcMar>
           </w:tcPr>
           <w:p>
@@ -1611,21 +2186,21 @@
               <w:rPr>
                 <w:b/>
                 <w:color w:val="FFFFFF"/>
-                <w:sz w:val="18"/>
+                <w:sz w:val="17"/>
               </w:rPr>
-              <w:t>Expense Category</w:t>
+              <w:t>Expense Category / Tender Rail</w:t>
             </w:r>
           </w:p>
         </w:tc>
         <w:tc>
           <w:tcPr>
-            <w:tcW w:type="dxa" w:w="1728"/>
+            <w:tcW w:type="dxa" w:w="1440"/>
             <w:shd w:fill="0F172A"/>
             <w:tcMar>
-              <w:top w:w="120" w:type="dxa"/>
-              <w:bottom w:w="120" w:type="dxa"/>
-              <w:left w:w="140" w:type="dxa"/>
-              <w:right w:w="140" w:type="dxa"/>
+              <w:top w:w="100" w:type="dxa"/>
+              <w:bottom w:w="100" w:type="dxa"/>
+              <w:left w:w="120" w:type="dxa"/>
+              <w:right w:w="120" w:type="dxa"/>
             </w:tcMar>
           </w:tcPr>
           <w:p>
@@ -1636,21 +2211,21 @@
               <w:rPr>
                 <w:b/>
                 <w:color w:val="FFFFFF"/>
-                <w:sz w:val="18"/>
+                <w:sz w:val="17"/>
               </w:rPr>
-              <w:t>Expenditure Realm</w:t>
+              <w:t>Realm / Rail</w:t>
             </w:r>
           </w:p>
         </w:tc>
         <w:tc>
           <w:tcPr>
-            <w:tcW w:type="dxa" w:w="1728"/>
+            <w:tcW w:type="dxa" w:w="1440"/>
             <w:shd w:fill="0F172A"/>
             <w:tcMar>
-              <w:top w:w="120" w:type="dxa"/>
-              <w:bottom w:w="120" w:type="dxa"/>
-              <w:left w:w="140" w:type="dxa"/>
-              <w:right w:w="140" w:type="dxa"/>
+              <w:top w:w="100" w:type="dxa"/>
+              <w:bottom w:w="100" w:type="dxa"/>
+              <w:left w:w="120" w:type="dxa"/>
+              <w:right w:w="120" w:type="dxa"/>
             </w:tcMar>
           </w:tcPr>
           <w:p>
@@ -1661,21 +2236,21 @@
               <w:rPr>
                 <w:b/>
                 <w:color w:val="FFFFFF"/>
-                <w:sz w:val="18"/>
+                <w:sz w:val="17"/>
               </w:rPr>
-              <w:t>Total Outflow (₹)</w:t>
+              <w:t>Total Outflows (₹ Cr)</w:t>
             </w:r>
           </w:p>
         </w:tc>
         <w:tc>
           <w:tcPr>
-            <w:tcW w:type="dxa" w:w="1728"/>
+            <w:tcW w:type="dxa" w:w="1440"/>
             <w:shd w:fill="0F172A"/>
             <w:tcMar>
-              <w:top w:w="120" w:type="dxa"/>
-              <w:bottom w:w="120" w:type="dxa"/>
-              <w:left w:w="140" w:type="dxa"/>
-              <w:right w:w="140" w:type="dxa"/>
+              <w:top w:w="100" w:type="dxa"/>
+              <w:bottom w:w="100" w:type="dxa"/>
+              <w:left w:w="120" w:type="dxa"/>
+              <w:right w:w="120" w:type="dxa"/>
             </w:tcMar>
           </w:tcPr>
           <w:p>
@@ -1686,21 +2261,21 @@
               <w:rPr>
                 <w:b/>
                 <w:color w:val="FFFFFF"/>
-                <w:sz w:val="18"/>
+                <w:sz w:val="17"/>
               </w:rPr>
-              <w:t>Budget Share (%)</w:t>
+              <w:t>Spend Share (%)</w:t>
             </w:r>
           </w:p>
         </w:tc>
         <w:tc>
           <w:tcPr>
-            <w:tcW w:type="dxa" w:w="1728"/>
+            <w:tcW w:type="dxa" w:w="1440"/>
             <w:shd w:fill="0F172A"/>
             <w:tcMar>
-              <w:top w:w="120" w:type="dxa"/>
-              <w:bottom w:w="120" w:type="dxa"/>
-              <w:left w:w="140" w:type="dxa"/>
-              <w:right w:w="140" w:type="dxa"/>
+              <w:top w:w="100" w:type="dxa"/>
+              <w:bottom w:w="100" w:type="dxa"/>
+              <w:left w:w="120" w:type="dxa"/>
+              <w:right w:w="120" w:type="dxa"/>
             </w:tcMar>
           </w:tcPr>
           <w:p>
@@ -1711,9 +2286,34 @@
               <w:rPr>
                 <w:b/>
                 <w:color w:val="FFFFFF"/>
-                <w:sz w:val="18"/>
+                <w:sz w:val="17"/>
               </w:rPr>
-              <w:t>Cost Control Level</w:t>
+              <w:t>MDR / Efficiency</w:t>
+            </w:r>
+          </w:p>
+        </w:tc>
+        <w:tc>
+          <w:tcPr>
+            <w:tcW w:type="dxa" w:w="1440"/>
+            <w:shd w:fill="0F172A"/>
+            <w:tcMar>
+              <w:top w:w="100" w:type="dxa"/>
+              <w:bottom w:w="100" w:type="dxa"/>
+              <w:left w:w="120" w:type="dxa"/>
+              <w:right w:w="120" w:type="dxa"/>
+            </w:tcMar>
+          </w:tcPr>
+          <w:p>
+            <w:pPr>
+              <w:jc w:val="left"/>
+            </w:pPr>
+            <w:r>
+              <w:rPr>
+                <w:b/>
+                <w:color w:val="FFFFFF"/>
+                <w:sz w:val="17"/>
+              </w:rPr>
+              <w:t>Risk Tier</w:t>
             </w:r>
           </w:p>
         </w:tc>
@@ -1721,106 +2321,127 @@
       <w:tr>
         <w:tc>
           <w:tcPr>
-            <w:tcW w:type="dxa" w:w="1728"/>
+            <w:tcW w:type="dxa" w:w="1440"/>
             <w:shd w:fill="FFFFFF"/>
             <w:tcMar>
-              <w:top w:w="80" w:type="dxa"/>
-              <w:bottom w:w="80" w:type="dxa"/>
-              <w:left w:w="140" w:type="dxa"/>
-              <w:right w:w="140" w:type="dxa"/>
+              <w:top w:w="70" w:type="dxa"/>
+              <w:bottom w:w="70" w:type="dxa"/>
+              <w:left w:w="120" w:type="dxa"/>
+              <w:right w:w="120" w:type="dxa"/>
             </w:tcMar>
           </w:tcPr>
           <w:p>
             <w:r>
               <w:rPr>
                 <w:color w:val="334155"/>
-                <w:sz w:val="17"/>
+                <w:sz w:val="16"/>
               </w:rPr>
-              <w:t>Branch Store Leases &amp; Rent</w:t>
+              <w:t>Rent &amp; Property Leases</w:t>
             </w:r>
           </w:p>
         </w:tc>
         <w:tc>
           <w:tcPr>
-            <w:tcW w:type="dxa" w:w="1728"/>
+            <w:tcW w:type="dxa" w:w="1440"/>
             <w:shd w:fill="FFFFFF"/>
             <w:tcMar>
-              <w:top w:w="80" w:type="dxa"/>
-              <w:bottom w:w="80" w:type="dxa"/>
-              <w:left w:w="140" w:type="dxa"/>
-              <w:right w:w="140" w:type="dxa"/>
+              <w:top w:w="70" w:type="dxa"/>
+              <w:bottom w:w="70" w:type="dxa"/>
+              <w:left w:w="120" w:type="dxa"/>
+              <w:right w:w="120" w:type="dxa"/>
             </w:tcMar>
           </w:tcPr>
           <w:p>
             <w:r>
               <w:rPr>
                 <w:color w:val="334155"/>
-                <w:sz w:val="17"/>
+                <w:sz w:val="16"/>
               </w:rPr>
-              <w:t>Stores OPEX</w:t>
+              <w:t>Corporate OPEX</w:t>
             </w:r>
           </w:p>
         </w:tc>
         <w:tc>
           <w:tcPr>
-            <w:tcW w:type="dxa" w:w="1728"/>
+            <w:tcW w:type="dxa" w:w="1440"/>
             <w:shd w:fill="FFFFFF"/>
             <w:tcMar>
-              <w:top w:w="80" w:type="dxa"/>
-              <w:bottom w:w="80" w:type="dxa"/>
-              <w:left w:w="140" w:type="dxa"/>
-              <w:right w:w="140" w:type="dxa"/>
+              <w:top w:w="70" w:type="dxa"/>
+              <w:bottom w:w="70" w:type="dxa"/>
+              <w:left w:w="120" w:type="dxa"/>
+              <w:right w:w="120" w:type="dxa"/>
             </w:tcMar>
           </w:tcPr>
           <w:p>
             <w:r>
               <w:rPr>
                 <w:color w:val="334155"/>
-                <w:sz w:val="17"/>
+                <w:sz w:val="16"/>
               </w:rPr>
-              <w:t>₹18.50 Cr</w:t>
+              <w:t>₹108.45 Cr</w:t>
             </w:r>
           </w:p>
         </w:tc>
         <w:tc>
           <w:tcPr>
-            <w:tcW w:type="dxa" w:w="1728"/>
+            <w:tcW w:type="dxa" w:w="1440"/>
             <w:shd w:fill="FFFFFF"/>
             <w:tcMar>
-              <w:top w:w="80" w:type="dxa"/>
-              <w:bottom w:w="80" w:type="dxa"/>
-              <w:left w:w="140" w:type="dxa"/>
-              <w:right w:w="140" w:type="dxa"/>
+              <w:top w:w="70" w:type="dxa"/>
+              <w:bottom w:w="70" w:type="dxa"/>
+              <w:left w:w="120" w:type="dxa"/>
+              <w:right w:w="120" w:type="dxa"/>
             </w:tcMar>
           </w:tcPr>
           <w:p>
             <w:r>
               <w:rPr>
                 <w:color w:val="334155"/>
-                <w:sz w:val="17"/>
+                <w:sz w:val="16"/>
               </w:rPr>
-              <w:t>22.85%</w:t>
+              <w:t>24.96%</w:t>
             </w:r>
           </w:p>
         </w:tc>
         <w:tc>
           <w:tcPr>
-            <w:tcW w:type="dxa" w:w="1728"/>
+            <w:tcW w:type="dxa" w:w="1440"/>
             <w:shd w:fill="FFFFFF"/>
             <w:tcMar>
-              <w:top w:w="80" w:type="dxa"/>
-              <w:bottom w:w="80" w:type="dxa"/>
-              <w:left w:w="140" w:type="dxa"/>
-              <w:right w:w="140" w:type="dxa"/>
+              <w:top w:w="70" w:type="dxa"/>
+              <w:bottom w:w="70" w:type="dxa"/>
+              <w:left w:w="120" w:type="dxa"/>
+              <w:right w:w="120" w:type="dxa"/>
             </w:tcMar>
           </w:tcPr>
           <w:p>
             <w:r>
               <w:rPr>
                 <w:color w:val="334155"/>
-                <w:sz w:val="17"/>
+                <w:sz w:val="16"/>
               </w:rPr>
-              <w:t>Fixed Long-Term Contracts</w:t>
+              <w:t>Fixed Contracts</w:t>
+            </w:r>
+          </w:p>
+        </w:tc>
+        <w:tc>
+          <w:tcPr>
+            <w:tcW w:type="dxa" w:w="1440"/>
+            <w:shd w:fill="FFFFFF"/>
+            <w:tcMar>
+              <w:top w:w="70" w:type="dxa"/>
+              <w:bottom w:w="70" w:type="dxa"/>
+              <w:left w:w="120" w:type="dxa"/>
+              <w:right w:w="120" w:type="dxa"/>
+            </w:tcMar>
+          </w:tcPr>
+          <w:p>
+            <w:r>
+              <w:rPr>
+                <w:color w:val="334155"/>
+                <w:sz w:val="16"/>
+              </w:rPr>
+              <w:t>Low Risk</w:t>
             </w:r>
           </w:p>
         </w:tc>
@@ -1828,106 +2449,127 @@
       <w:tr>
         <w:tc>
           <w:tcPr>
-            <w:tcW w:type="dxa" w:w="1728"/>
+            <w:tcW w:type="dxa" w:w="1440"/>
             <w:shd w:fill="F8FAFC"/>
             <w:tcMar>
-              <w:top w:w="80" w:type="dxa"/>
-              <w:bottom w:w="80" w:type="dxa"/>
-              <w:left w:w="140" w:type="dxa"/>
-              <w:right w:w="140" w:type="dxa"/>
+              <w:top w:w="70" w:type="dxa"/>
+              <w:bottom w:w="70" w:type="dxa"/>
+              <w:left w:w="120" w:type="dxa"/>
+              <w:right w:w="120" w:type="dxa"/>
             </w:tcMar>
           </w:tcPr>
           <w:p>
             <w:r>
               <w:rPr>
                 <w:color w:val="334155"/>
-                <w:sz w:val="17"/>
+                <w:sz w:val="16"/>
               </w:rPr>
-              <w:t>Corporate HQ Salaries</w:t>
+              <w:t>Marketing &amp; Advertising Media</w:t>
             </w:r>
           </w:p>
         </w:tc>
         <w:tc>
           <w:tcPr>
-            <w:tcW w:type="dxa" w:w="1728"/>
+            <w:tcW w:type="dxa" w:w="1440"/>
             <w:shd w:fill="F8FAFC"/>
             <w:tcMar>
-              <w:top w:w="80" w:type="dxa"/>
-              <w:bottom w:w="80" w:type="dxa"/>
-              <w:left w:w="140" w:type="dxa"/>
-              <w:right w:w="140" w:type="dxa"/>
+              <w:top w:w="70" w:type="dxa"/>
+              <w:bottom w:w="70" w:type="dxa"/>
+              <w:left w:w="120" w:type="dxa"/>
+              <w:right w:w="120" w:type="dxa"/>
             </w:tcMar>
           </w:tcPr>
           <w:p>
             <w:r>
               <w:rPr>
                 <w:color w:val="334155"/>
-                <w:sz w:val="17"/>
+                <w:sz w:val="16"/>
               </w:rPr>
-              <w:t>HR / Finance</w:t>
+              <w:t>Corporate OPEX</w:t>
             </w:r>
           </w:p>
         </w:tc>
         <w:tc>
           <w:tcPr>
-            <w:tcW w:type="dxa" w:w="1728"/>
+            <w:tcW w:type="dxa" w:w="1440"/>
             <w:shd w:fill="F8FAFC"/>
             <w:tcMar>
-              <w:top w:w="80" w:type="dxa"/>
-              <w:bottom w:w="80" w:type="dxa"/>
-              <w:left w:w="140" w:type="dxa"/>
-              <w:right w:w="140" w:type="dxa"/>
+              <w:top w:w="70" w:type="dxa"/>
+              <w:bottom w:w="70" w:type="dxa"/>
+              <w:left w:w="120" w:type="dxa"/>
+              <w:right w:w="120" w:type="dxa"/>
             </w:tcMar>
           </w:tcPr>
           <w:p>
             <w:r>
               <w:rPr>
                 <w:color w:val="334155"/>
-                <w:sz w:val="17"/>
+                <w:sz w:val="16"/>
               </w:rPr>
-              <w:t>₹18.98 Cr</w:t>
+              <w:t>₹85.20 Cr</w:t>
             </w:r>
           </w:p>
         </w:tc>
         <w:tc>
           <w:tcPr>
-            <w:tcW w:type="dxa" w:w="1728"/>
+            <w:tcW w:type="dxa" w:w="1440"/>
             <w:shd w:fill="F8FAFC"/>
             <w:tcMar>
-              <w:top w:w="80" w:type="dxa"/>
-              <w:bottom w:w="80" w:type="dxa"/>
-              <w:left w:w="140" w:type="dxa"/>
-              <w:right w:w="140" w:type="dxa"/>
+              <w:top w:w="70" w:type="dxa"/>
+              <w:bottom w:w="70" w:type="dxa"/>
+              <w:left w:w="120" w:type="dxa"/>
+              <w:right w:w="120" w:type="dxa"/>
             </w:tcMar>
           </w:tcPr>
           <w:p>
             <w:r>
               <w:rPr>
                 <w:color w:val="334155"/>
-                <w:sz w:val="17"/>
+                <w:sz w:val="16"/>
               </w:rPr>
-              <w:t>23.45%</w:t>
+              <w:t>19.61%</w:t>
             </w:r>
           </w:p>
         </w:tc>
         <w:tc>
           <w:tcPr>
-            <w:tcW w:type="dxa" w:w="1728"/>
+            <w:tcW w:type="dxa" w:w="1440"/>
             <w:shd w:fill="F8FAFC"/>
             <w:tcMar>
-              <w:top w:w="80" w:type="dxa"/>
-              <w:bottom w:w="80" w:type="dxa"/>
-              <w:left w:w="140" w:type="dxa"/>
-              <w:right w:w="140" w:type="dxa"/>
+              <w:top w:w="70" w:type="dxa"/>
+              <w:bottom w:w="70" w:type="dxa"/>
+              <w:left w:w="120" w:type="dxa"/>
+              <w:right w:w="120" w:type="dxa"/>
             </w:tcMar>
           </w:tcPr>
           <w:p>
             <w:r>
               <w:rPr>
                 <w:color w:val="334155"/>
-                <w:sz w:val="17"/>
+                <w:sz w:val="16"/>
               </w:rPr>
-              <w:t>Contractual Core Payroll</w:t>
+              <w:t>ROI Tracked</w:t>
+            </w:r>
+          </w:p>
+        </w:tc>
+        <w:tc>
+          <w:tcPr>
+            <w:tcW w:type="dxa" w:w="1440"/>
+            <w:shd w:fill="F8FAFC"/>
+            <w:tcMar>
+              <w:top w:w="70" w:type="dxa"/>
+              <w:bottom w:w="70" w:type="dxa"/>
+              <w:left w:w="120" w:type="dxa"/>
+              <w:right w:w="120" w:type="dxa"/>
+            </w:tcMar>
+          </w:tcPr>
+          <w:p>
+            <w:r>
+              <w:rPr>
+                <w:color w:val="334155"/>
+                <w:sz w:val="16"/>
+              </w:rPr>
+              <w:t>Medium Tier</w:t>
             </w:r>
           </w:p>
         </w:tc>
@@ -1935,106 +2577,127 @@
       <w:tr>
         <w:tc>
           <w:tcPr>
-            <w:tcW w:type="dxa" w:w="1728"/>
+            <w:tcW w:type="dxa" w:w="1440"/>
             <w:shd w:fill="FFFFFF"/>
             <w:tcMar>
-              <w:top w:w="80" w:type="dxa"/>
-              <w:bottom w:w="80" w:type="dxa"/>
-              <w:left w:w="140" w:type="dxa"/>
-              <w:right w:w="140" w:type="dxa"/>
+              <w:top w:w="70" w:type="dxa"/>
+              <w:bottom w:w="70" w:type="dxa"/>
+              <w:left w:w="120" w:type="dxa"/>
+              <w:right w:w="120" w:type="dxa"/>
             </w:tcMar>
           </w:tcPr>
           <w:p>
             <w:r>
               <w:rPr>
                 <w:color w:val="334155"/>
-                <w:sz w:val="17"/>
+                <w:sz w:val="16"/>
               </w:rPr>
-              <w:t>Store Utilities &amp; Facilities</w:t>
+              <w:t>Enterprise Cloud &amp; Software</w:t>
             </w:r>
           </w:p>
         </w:tc>
         <w:tc>
           <w:tcPr>
-            <w:tcW w:type="dxa" w:w="1728"/>
+            <w:tcW w:type="dxa" w:w="1440"/>
             <w:shd w:fill="FFFFFF"/>
             <w:tcMar>
-              <w:top w:w="80" w:type="dxa"/>
-              <w:bottom w:w="80" w:type="dxa"/>
-              <w:left w:w="140" w:type="dxa"/>
-              <w:right w:w="140" w:type="dxa"/>
+              <w:top w:w="70" w:type="dxa"/>
+              <w:bottom w:w="70" w:type="dxa"/>
+              <w:left w:w="120" w:type="dxa"/>
+              <w:right w:w="120" w:type="dxa"/>
             </w:tcMar>
           </w:tcPr>
           <w:p>
             <w:r>
               <w:rPr>
                 <w:color w:val="334155"/>
-                <w:sz w:val="17"/>
+                <w:sz w:val="16"/>
               </w:rPr>
-              <w:t>Stores OPEX</w:t>
+              <w:t>Corporate OPEX</w:t>
             </w:r>
           </w:p>
         </w:tc>
         <w:tc>
           <w:tcPr>
-            <w:tcW w:type="dxa" w:w="1728"/>
+            <w:tcW w:type="dxa" w:w="1440"/>
             <w:shd w:fill="FFFFFF"/>
             <w:tcMar>
-              <w:top w:w="80" w:type="dxa"/>
-              <w:bottom w:w="80" w:type="dxa"/>
-              <w:left w:w="140" w:type="dxa"/>
-              <w:right w:w="140" w:type="dxa"/>
+              <w:top w:w="70" w:type="dxa"/>
+              <w:bottom w:w="70" w:type="dxa"/>
+              <w:left w:w="120" w:type="dxa"/>
+              <w:right w:w="120" w:type="dxa"/>
             </w:tcMar>
           </w:tcPr>
           <w:p>
             <w:r>
               <w:rPr>
                 <w:color w:val="334155"/>
-                <w:sz w:val="17"/>
+                <w:sz w:val="16"/>
               </w:rPr>
-              <w:t>₹12.30 Cr</w:t>
+              <w:t>₹64.12 Cr</w:t>
             </w:r>
           </w:p>
         </w:tc>
         <w:tc>
           <w:tcPr>
-            <w:tcW w:type="dxa" w:w="1728"/>
+            <w:tcW w:type="dxa" w:w="1440"/>
             <w:shd w:fill="FFFFFF"/>
             <w:tcMar>
-              <w:top w:w="80" w:type="dxa"/>
-              <w:bottom w:w="80" w:type="dxa"/>
-              <w:left w:w="140" w:type="dxa"/>
-              <w:right w:w="140" w:type="dxa"/>
+              <w:top w:w="70" w:type="dxa"/>
+              <w:bottom w:w="70" w:type="dxa"/>
+              <w:left w:w="120" w:type="dxa"/>
+              <w:right w:w="120" w:type="dxa"/>
             </w:tcMar>
           </w:tcPr>
           <w:p>
             <w:r>
               <w:rPr>
                 <w:color w:val="334155"/>
-                <w:sz w:val="17"/>
+                <w:sz w:val="16"/>
               </w:rPr>
-              <w:t>15.20%</w:t>
+              <w:t>14.76%</w:t>
             </w:r>
           </w:p>
         </w:tc>
         <w:tc>
           <w:tcPr>
-            <w:tcW w:type="dxa" w:w="1728"/>
+            <w:tcW w:type="dxa" w:w="1440"/>
             <w:shd w:fill="FFFFFF"/>
             <w:tcMar>
-              <w:top w:w="80" w:type="dxa"/>
-              <w:bottom w:w="80" w:type="dxa"/>
-              <w:left w:w="140" w:type="dxa"/>
-              <w:right w:w="140" w:type="dxa"/>
+              <w:top w:w="70" w:type="dxa"/>
+              <w:bottom w:w="70" w:type="dxa"/>
+              <w:left w:w="120" w:type="dxa"/>
+              <w:right w:w="120" w:type="dxa"/>
             </w:tcMar>
           </w:tcPr>
           <w:p>
             <w:r>
               <w:rPr>
                 <w:color w:val="334155"/>
-                <w:sz w:val="17"/>
+                <w:sz w:val="16"/>
               </w:rPr>
-              <w:t>Variable Energy Audit Required</w:t>
+              <w:t>SaaS Licenses</w:t>
+            </w:r>
+          </w:p>
+        </w:tc>
+        <w:tc>
+          <w:tcPr>
+            <w:tcW w:type="dxa" w:w="1440"/>
+            <w:shd w:fill="FFFFFF"/>
+            <w:tcMar>
+              <w:top w:w="70" w:type="dxa"/>
+              <w:bottom w:w="70" w:type="dxa"/>
+              <w:left w:w="120" w:type="dxa"/>
+              <w:right w:w="120" w:type="dxa"/>
+            </w:tcMar>
+          </w:tcPr>
+          <w:p>
+            <w:r>
+              <w:rPr>
+                <w:color w:val="334155"/>
+                <w:sz w:val="16"/>
+              </w:rPr>
+              <w:t>Low Risk</w:t>
             </w:r>
           </w:p>
         </w:tc>
@@ -2042,106 +2705,127 @@
       <w:tr>
         <w:tc>
           <w:tcPr>
-            <w:tcW w:type="dxa" w:w="1728"/>
+            <w:tcW w:type="dxa" w:w="1440"/>
             <w:shd w:fill="F8FAFC"/>
             <w:tcMar>
-              <w:top w:w="80" w:type="dxa"/>
-              <w:bottom w:w="80" w:type="dxa"/>
-              <w:left w:w="140" w:type="dxa"/>
-              <w:right w:w="140" w:type="dxa"/>
+              <w:top w:w="70" w:type="dxa"/>
+              <w:bottom w:w="70" w:type="dxa"/>
+              <w:left w:w="120" w:type="dxa"/>
+              <w:right w:w="120" w:type="dxa"/>
             </w:tcMar>
           </w:tcPr>
           <w:p>
             <w:r>
               <w:rPr>
                 <w:color w:val="334155"/>
-                <w:sz w:val="17"/>
+                <w:sz w:val="16"/>
               </w:rPr>
-              <w:t>Technology &amp; Cloud Infrastructure</w:t>
+              <w:t>Utilities, Fuel &amp; Power</w:t>
             </w:r>
           </w:p>
         </w:tc>
         <w:tc>
           <w:tcPr>
-            <w:tcW w:type="dxa" w:w="1728"/>
+            <w:tcW w:type="dxa" w:w="1440"/>
             <w:shd w:fill="F8FAFC"/>
             <w:tcMar>
-              <w:top w:w="80" w:type="dxa"/>
-              <w:bottom w:w="80" w:type="dxa"/>
-              <w:left w:w="140" w:type="dxa"/>
-              <w:right w:w="140" w:type="dxa"/>
+              <w:top w:w="70" w:type="dxa"/>
+              <w:bottom w:w="70" w:type="dxa"/>
+              <w:left w:w="120" w:type="dxa"/>
+              <w:right w:w="120" w:type="dxa"/>
             </w:tcMar>
           </w:tcPr>
           <w:p>
             <w:r>
               <w:rPr>
                 <w:color w:val="334155"/>
-                <w:sz w:val="17"/>
+                <w:sz w:val="16"/>
               </w:rPr>
-              <w:t>Corporate OPEX</w:t>
+              <w:t>Store/HQ OPEX</w:t>
             </w:r>
           </w:p>
         </w:tc>
         <w:tc>
           <w:tcPr>
-            <w:tcW w:type="dxa" w:w="1728"/>
+            <w:tcW w:type="dxa" w:w="1440"/>
             <w:shd w:fill="F8FAFC"/>
             <w:tcMar>
-              <w:top w:w="80" w:type="dxa"/>
-              <w:bottom w:w="80" w:type="dxa"/>
-              <w:left w:w="140" w:type="dxa"/>
-              <w:right w:w="140" w:type="dxa"/>
+              <w:top w:w="70" w:type="dxa"/>
+              <w:bottom w:w="70" w:type="dxa"/>
+              <w:left w:w="120" w:type="dxa"/>
+              <w:right w:w="120" w:type="dxa"/>
             </w:tcMar>
           </w:tcPr>
           <w:p>
             <w:r>
               <w:rPr>
                 <w:color w:val="334155"/>
-                <w:sz w:val="17"/>
+                <w:sz w:val="16"/>
               </w:rPr>
-              <w:t>₹11.20 Cr</w:t>
+              <w:t>₹58.90 Cr</w:t>
             </w:r>
           </w:p>
         </w:tc>
         <w:tc>
           <w:tcPr>
-            <w:tcW w:type="dxa" w:w="1728"/>
+            <w:tcW w:type="dxa" w:w="1440"/>
             <w:shd w:fill="F8FAFC"/>
             <w:tcMar>
-              <w:top w:w="80" w:type="dxa"/>
-              <w:bottom w:w="80" w:type="dxa"/>
-              <w:left w:w="140" w:type="dxa"/>
-              <w:right w:w="140" w:type="dxa"/>
+              <w:top w:w="70" w:type="dxa"/>
+              <w:bottom w:w="70" w:type="dxa"/>
+              <w:left w:w="120" w:type="dxa"/>
+              <w:right w:w="120" w:type="dxa"/>
             </w:tcMar>
           </w:tcPr>
           <w:p>
             <w:r>
               <w:rPr>
                 <w:color w:val="334155"/>
-                <w:sz w:val="17"/>
+                <w:sz w:val="16"/>
               </w:rPr>
-              <w:t>13.84%</w:t>
+              <w:t>13.56%</w:t>
             </w:r>
           </w:p>
         </w:tc>
         <w:tc>
           <w:tcPr>
-            <w:tcW w:type="dxa" w:w="1728"/>
+            <w:tcW w:type="dxa" w:w="1440"/>
             <w:shd w:fill="F8FAFC"/>
             <w:tcMar>
-              <w:top w:w="80" w:type="dxa"/>
-              <w:bottom w:w="80" w:type="dxa"/>
-              <w:left w:w="140" w:type="dxa"/>
-              <w:right w:w="140" w:type="dxa"/>
+              <w:top w:w="70" w:type="dxa"/>
+              <w:bottom w:w="70" w:type="dxa"/>
+              <w:left w:w="120" w:type="dxa"/>
+              <w:right w:w="120" w:type="dxa"/>
             </w:tcMar>
           </w:tcPr>
           <w:p>
             <w:r>
               <w:rPr>
                 <w:color w:val="334155"/>
-                <w:sz w:val="17"/>
+                <w:sz w:val="16"/>
               </w:rPr>
-              <w:t>SaaS &amp; Hosting Rationalization</w:t>
+              <w:t>Energy Audited</w:t>
+            </w:r>
+          </w:p>
+        </w:tc>
+        <w:tc>
+          <w:tcPr>
+            <w:tcW w:type="dxa" w:w="1440"/>
+            <w:shd w:fill="F8FAFC"/>
+            <w:tcMar>
+              <w:top w:w="70" w:type="dxa"/>
+              <w:bottom w:w="70" w:type="dxa"/>
+              <w:left w:w="120" w:type="dxa"/>
+              <w:right w:w="120" w:type="dxa"/>
+            </w:tcMar>
+          </w:tcPr>
+          <w:p>
+            <w:r>
+              <w:rPr>
+                <w:color w:val="334155"/>
+                <w:sz w:val="16"/>
+              </w:rPr>
+              <w:t>Controllable</w:t>
             </w:r>
           </w:p>
         </w:tc>
@@ -2149,106 +2833,127 @@
       <w:tr>
         <w:tc>
           <w:tcPr>
-            <w:tcW w:type="dxa" w:w="1728"/>
+            <w:tcW w:type="dxa" w:w="1440"/>
             <w:shd w:fill="FFFFFF"/>
             <w:tcMar>
-              <w:top w:w="80" w:type="dxa"/>
-              <w:bottom w:w="80" w:type="dxa"/>
-              <w:left w:w="140" w:type="dxa"/>
-              <w:right w:w="140" w:type="dxa"/>
+              <w:top w:w="70" w:type="dxa"/>
+              <w:bottom w:w="70" w:type="dxa"/>
+              <w:left w:w="120" w:type="dxa"/>
+              <w:right w:w="120" w:type="dxa"/>
             </w:tcMar>
           </w:tcPr>
           <w:p>
             <w:r>
               <w:rPr>
                 <w:color w:val="334155"/>
-                <w:sz w:val="17"/>
+                <w:sz w:val="16"/>
               </w:rPr>
-              <w:t>Marketing &amp; Advertising Media</w:t>
+              <w:t>Freight Logistics &amp; Transfers</w:t>
             </w:r>
           </w:p>
         </w:tc>
         <w:tc>
           <w:tcPr>
-            <w:tcW w:type="dxa" w:w="1728"/>
+            <w:tcW w:type="dxa" w:w="1440"/>
             <w:shd w:fill="FFFFFF"/>
             <w:tcMar>
-              <w:top w:w="80" w:type="dxa"/>
-              <w:bottom w:w="80" w:type="dxa"/>
-              <w:left w:w="140" w:type="dxa"/>
-              <w:right w:w="140" w:type="dxa"/>
+              <w:top w:w="70" w:type="dxa"/>
+              <w:bottom w:w="70" w:type="dxa"/>
+              <w:left w:w="120" w:type="dxa"/>
+              <w:right w:w="120" w:type="dxa"/>
             </w:tcMar>
           </w:tcPr>
           <w:p>
             <w:r>
               <w:rPr>
                 <w:color w:val="334155"/>
-                <w:sz w:val="17"/>
+                <w:sz w:val="16"/>
               </w:rPr>
-              <w:t>Marketing OPEX</w:t>
+              <w:t>Logistics OPEX</w:t>
             </w:r>
           </w:p>
         </w:tc>
         <w:tc>
           <w:tcPr>
-            <w:tcW w:type="dxa" w:w="1728"/>
+            <w:tcW w:type="dxa" w:w="1440"/>
             <w:shd w:fill="FFFFFF"/>
             <w:tcMar>
-              <w:top w:w="80" w:type="dxa"/>
-              <w:bottom w:w="80" w:type="dxa"/>
-              <w:left w:w="140" w:type="dxa"/>
-              <w:right w:w="140" w:type="dxa"/>
+              <w:top w:w="70" w:type="dxa"/>
+              <w:bottom w:w="70" w:type="dxa"/>
+              <w:left w:w="120" w:type="dxa"/>
+              <w:right w:w="120" w:type="dxa"/>
             </w:tcMar>
           </w:tcPr>
           <w:p>
             <w:r>
               <w:rPr>
                 <w:color w:val="334155"/>
-                <w:sz w:val="17"/>
+                <w:sz w:val="16"/>
               </w:rPr>
-              <w:t>₹10.30 Cr</w:t>
+              <w:t>₹52.40 Cr</w:t>
             </w:r>
           </w:p>
         </w:tc>
         <w:tc>
           <w:tcPr>
-            <w:tcW w:type="dxa" w:w="1728"/>
+            <w:tcW w:type="dxa" w:w="1440"/>
             <w:shd w:fill="FFFFFF"/>
             <w:tcMar>
-              <w:top w:w="80" w:type="dxa"/>
-              <w:bottom w:w="80" w:type="dxa"/>
-              <w:left w:w="140" w:type="dxa"/>
-              <w:right w:w="140" w:type="dxa"/>
+              <w:top w:w="70" w:type="dxa"/>
+              <w:bottom w:w="70" w:type="dxa"/>
+              <w:left w:w="120" w:type="dxa"/>
+              <w:right w:w="120" w:type="dxa"/>
             </w:tcMar>
           </w:tcPr>
           <w:p>
             <w:r>
               <w:rPr>
                 <w:color w:val="334155"/>
-                <w:sz w:val="17"/>
+                <w:sz w:val="16"/>
               </w:rPr>
-              <w:t>12.72%</w:t>
+              <w:t>12.06%</w:t>
             </w:r>
           </w:p>
         </w:tc>
         <w:tc>
           <w:tcPr>
-            <w:tcW w:type="dxa" w:w="1728"/>
+            <w:tcW w:type="dxa" w:w="1440"/>
             <w:shd w:fill="FFFFFF"/>
             <w:tcMar>
-              <w:top w:w="80" w:type="dxa"/>
-              <w:bottom w:w="80" w:type="dxa"/>
-              <w:left w:w="140" w:type="dxa"/>
-              <w:right w:w="140" w:type="dxa"/>
+              <w:top w:w="70" w:type="dxa"/>
+              <w:bottom w:w="70" w:type="dxa"/>
+              <w:left w:w="120" w:type="dxa"/>
+              <w:right w:w="120" w:type="dxa"/>
             </w:tcMar>
           </w:tcPr>
           <w:p>
             <w:r>
               <w:rPr>
                 <w:color w:val="334155"/>
-                <w:sz w:val="17"/>
+                <w:sz w:val="16"/>
               </w:rPr>
-              <w:t>Performance ROI Reallocation</w:t>
+              <w:t>Variable Fleet</w:t>
+            </w:r>
+          </w:p>
+        </w:tc>
+        <w:tc>
+          <w:tcPr>
+            <w:tcW w:type="dxa" w:w="1440"/>
+            <w:shd w:fill="FFFFFF"/>
+            <w:tcMar>
+              <w:top w:w="70" w:type="dxa"/>
+              <w:bottom w:w="70" w:type="dxa"/>
+              <w:left w:w="120" w:type="dxa"/>
+              <w:right w:w="120" w:type="dxa"/>
+            </w:tcMar>
+          </w:tcPr>
+          <w:p>
+            <w:r>
+              <w:rPr>
+                <w:color w:val="334155"/>
+                <w:sz w:val="16"/>
+              </w:rPr>
+              <w:t>Attention</w:t>
             </w:r>
           </w:p>
         </w:tc>
@@ -2256,106 +2961,383 @@
       <w:tr>
         <w:tc>
           <w:tcPr>
-            <w:tcW w:type="dxa" w:w="1728"/>
+            <w:tcW w:type="dxa" w:w="1440"/>
             <w:shd w:fill="F8FAFC"/>
             <w:tcMar>
-              <w:top w:w="80" w:type="dxa"/>
-              <w:bottom w:w="80" w:type="dxa"/>
-              <w:left w:w="140" w:type="dxa"/>
-              <w:right w:w="140" w:type="dxa"/>
+              <w:top w:w="70" w:type="dxa"/>
+              <w:bottom w:w="70" w:type="dxa"/>
+              <w:left w:w="120" w:type="dxa"/>
+              <w:right w:w="120" w:type="dxa"/>
             </w:tcMar>
           </w:tcPr>
           <w:p>
             <w:r>
               <w:rPr>
                 <w:color w:val="334155"/>
-                <w:sz w:val="17"/>
+                <w:sz w:val="16"/>
               </w:rPr>
-              <w:t>Store Maintenance &amp; Logistics</w:t>
+              <w:t>UPI Settlement Rail</w:t>
             </w:r>
           </w:p>
         </w:tc>
         <w:tc>
           <w:tcPr>
-            <w:tcW w:type="dxa" w:w="1728"/>
+            <w:tcW w:type="dxa" w:w="1440"/>
             <w:shd w:fill="F8FAFC"/>
             <w:tcMar>
-              <w:top w:w="80" w:type="dxa"/>
-              <w:bottom w:w="80" w:type="dxa"/>
-              <w:left w:w="140" w:type="dxa"/>
-              <w:right w:w="140" w:type="dxa"/>
+              <w:top w:w="70" w:type="dxa"/>
+              <w:bottom w:w="70" w:type="dxa"/>
+              <w:left w:w="120" w:type="dxa"/>
+              <w:right w:w="120" w:type="dxa"/>
             </w:tcMar>
           </w:tcPr>
           <w:p>
             <w:r>
               <w:rPr>
                 <w:color w:val="334155"/>
-                <w:sz w:val="17"/>
+                <w:sz w:val="16"/>
               </w:rPr>
-              <w:t>Operations OPEX</w:t>
+              <w:t>Digital Rail</w:t>
             </w:r>
           </w:p>
         </w:tc>
         <w:tc>
           <w:tcPr>
-            <w:tcW w:type="dxa" w:w="1728"/>
+            <w:tcW w:type="dxa" w:w="1440"/>
             <w:shd w:fill="F8FAFC"/>
             <w:tcMar>
-              <w:top w:w="80" w:type="dxa"/>
-              <w:bottom w:w="80" w:type="dxa"/>
-              <w:left w:w="140" w:type="dxa"/>
-              <w:right w:w="140" w:type="dxa"/>
+              <w:top w:w="70" w:type="dxa"/>
+              <w:bottom w:w="70" w:type="dxa"/>
+              <w:left w:w="120" w:type="dxa"/>
+              <w:right w:w="120" w:type="dxa"/>
             </w:tcMar>
           </w:tcPr>
           <w:p>
             <w:r>
               <w:rPr>
                 <w:color w:val="334155"/>
-                <w:sz w:val="17"/>
+                <w:sz w:val="16"/>
               </w:rPr>
-              <w:t>₹9.67 Cr</w:t>
+              <w:t>₹312.40 Cr</w:t>
             </w:r>
           </w:p>
         </w:tc>
         <w:tc>
           <w:tcPr>
-            <w:tcW w:type="dxa" w:w="1728"/>
+            <w:tcW w:type="dxa" w:w="1440"/>
             <w:shd w:fill="F8FAFC"/>
             <w:tcMar>
-              <w:top w:w="80" w:type="dxa"/>
-              <w:bottom w:w="80" w:type="dxa"/>
-              <w:left w:w="140" w:type="dxa"/>
-              <w:right w:w="140" w:type="dxa"/>
+              <w:top w:w="70" w:type="dxa"/>
+              <w:bottom w:w="70" w:type="dxa"/>
+              <w:left w:w="120" w:type="dxa"/>
+              <w:right w:w="120" w:type="dxa"/>
             </w:tcMar>
           </w:tcPr>
           <w:p>
             <w:r>
               <w:rPr>
                 <w:color w:val="334155"/>
-                <w:sz w:val="17"/>
+                <w:sz w:val="16"/>
               </w:rPr>
-              <w:t>11.94%</w:t>
+              <w:t>44.55%</w:t>
             </w:r>
           </w:p>
         </w:tc>
         <w:tc>
           <w:tcPr>
-            <w:tcW w:type="dxa" w:w="1728"/>
+            <w:tcW w:type="dxa" w:w="1440"/>
             <w:shd w:fill="F8FAFC"/>
             <w:tcMar>
-              <w:top w:w="80" w:type="dxa"/>
-              <w:bottom w:w="80" w:type="dxa"/>
-              <w:left w:w="140" w:type="dxa"/>
-              <w:right w:w="140" w:type="dxa"/>
+              <w:top w:w="70" w:type="dxa"/>
+              <w:bottom w:w="70" w:type="dxa"/>
+              <w:left w:w="120" w:type="dxa"/>
+              <w:right w:w="120" w:type="dxa"/>
             </w:tcMar>
           </w:tcPr>
           <w:p>
             <w:r>
               <w:rPr>
                 <w:color w:val="334155"/>
-                <w:sz w:val="17"/>
+                <w:sz w:val="16"/>
               </w:rPr>
-              <w:t>Preventive Service Scheduling</w:t>
+              <w:t>0.00% Zero MDR</w:t>
+            </w:r>
+          </w:p>
+        </w:tc>
+        <w:tc>
+          <w:tcPr>
+            <w:tcW w:type="dxa" w:w="1440"/>
+            <w:shd w:fill="F8FAFC"/>
+            <w:tcMar>
+              <w:top w:w="70" w:type="dxa"/>
+              <w:bottom w:w="70" w:type="dxa"/>
+              <w:left w:w="120" w:type="dxa"/>
+              <w:right w:w="120" w:type="dxa"/>
+            </w:tcMar>
+          </w:tcPr>
+          <w:p>
+            <w:r>
+              <w:rPr>
+                <w:color w:val="334155"/>
+                <w:sz w:val="16"/>
+              </w:rPr>
+              <w:t>Lowest (1.2% Dispute)</w:t>
+            </w:r>
+          </w:p>
+        </w:tc>
+      </w:tr>
+      <w:tr>
+        <w:tc>
+          <w:tcPr>
+            <w:tcW w:type="dxa" w:w="1440"/>
+            <w:shd w:fill="FFFFFF"/>
+            <w:tcMar>
+              <w:top w:w="70" w:type="dxa"/>
+              <w:bottom w:w="70" w:type="dxa"/>
+              <w:left w:w="120" w:type="dxa"/>
+              <w:right w:w="120" w:type="dxa"/>
+            </w:tcMar>
+          </w:tcPr>
+          <w:p>
+            <w:r>
+              <w:rPr>
+                <w:color w:val="334155"/>
+                <w:sz w:val="16"/>
+              </w:rPr>
+              <w:t>Credit &amp; Debit Cards</w:t>
+            </w:r>
+          </w:p>
+        </w:tc>
+        <w:tc>
+          <w:tcPr>
+            <w:tcW w:type="dxa" w:w="1440"/>
+            <w:shd w:fill="FFFFFF"/>
+            <w:tcMar>
+              <w:top w:w="70" w:type="dxa"/>
+              <w:bottom w:w="70" w:type="dxa"/>
+              <w:left w:w="120" w:type="dxa"/>
+              <w:right w:w="120" w:type="dxa"/>
+            </w:tcMar>
+          </w:tcPr>
+          <w:p>
+            <w:r>
+              <w:rPr>
+                <w:color w:val="334155"/>
+                <w:sz w:val="16"/>
+              </w:rPr>
+              <w:t>Card Rail</w:t>
+            </w:r>
+          </w:p>
+        </w:tc>
+        <w:tc>
+          <w:tcPr>
+            <w:tcW w:type="dxa" w:w="1440"/>
+            <w:shd w:fill="FFFFFF"/>
+            <w:tcMar>
+              <w:top w:w="70" w:type="dxa"/>
+              <w:bottom w:w="70" w:type="dxa"/>
+              <w:left w:w="120" w:type="dxa"/>
+              <w:right w:w="120" w:type="dxa"/>
+            </w:tcMar>
+          </w:tcPr>
+          <w:p>
+            <w:r>
+              <w:rPr>
+                <w:color w:val="334155"/>
+                <w:sz w:val="16"/>
+              </w:rPr>
+              <w:t>₹241.10 Cr</w:t>
+            </w:r>
+          </w:p>
+        </w:tc>
+        <w:tc>
+          <w:tcPr>
+            <w:tcW w:type="dxa" w:w="1440"/>
+            <w:shd w:fill="FFFFFF"/>
+            <w:tcMar>
+              <w:top w:w="70" w:type="dxa"/>
+              <w:bottom w:w="70" w:type="dxa"/>
+              <w:left w:w="120" w:type="dxa"/>
+              <w:right w:w="120" w:type="dxa"/>
+            </w:tcMar>
+          </w:tcPr>
+          <w:p>
+            <w:r>
+              <w:rPr>
+                <w:color w:val="334155"/>
+                <w:sz w:val="16"/>
+              </w:rPr>
+              <w:t>34.38%</w:t>
+            </w:r>
+          </w:p>
+        </w:tc>
+        <w:tc>
+          <w:tcPr>
+            <w:tcW w:type="dxa" w:w="1440"/>
+            <w:shd w:fill="FFFFFF"/>
+            <w:tcMar>
+              <w:top w:w="70" w:type="dxa"/>
+              <w:bottom w:w="70" w:type="dxa"/>
+              <w:left w:w="120" w:type="dxa"/>
+              <w:right w:w="120" w:type="dxa"/>
+            </w:tcMar>
+          </w:tcPr>
+          <w:p>
+            <w:r>
+              <w:rPr>
+                <w:color w:val="334155"/>
+                <w:sz w:val="16"/>
+              </w:rPr>
+              <w:t>1.50% Interchange</w:t>
+            </w:r>
+          </w:p>
+        </w:tc>
+        <w:tc>
+          <w:tcPr>
+            <w:tcW w:type="dxa" w:w="1440"/>
+            <w:shd w:fill="FFFFFF"/>
+            <w:tcMar>
+              <w:top w:w="70" w:type="dxa"/>
+              <w:bottom w:w="70" w:type="dxa"/>
+              <w:left w:w="120" w:type="dxa"/>
+              <w:right w:w="120" w:type="dxa"/>
+            </w:tcMar>
+          </w:tcPr>
+          <w:p>
+            <w:r>
+              <w:rPr>
+                <w:color w:val="334155"/>
+                <w:sz w:val="16"/>
+              </w:rPr>
+              <w:t>Standard (2.8% Dispute)</w:t>
+            </w:r>
+          </w:p>
+        </w:tc>
+      </w:tr>
+      <w:tr>
+        <w:tc>
+          <w:tcPr>
+            <w:tcW w:type="dxa" w:w="1440"/>
+            <w:shd w:fill="F8FAFC"/>
+            <w:tcMar>
+              <w:top w:w="70" w:type="dxa"/>
+              <w:bottom w:w="70" w:type="dxa"/>
+              <w:left w:w="120" w:type="dxa"/>
+              <w:right w:w="120" w:type="dxa"/>
+            </w:tcMar>
+          </w:tcPr>
+          <w:p>
+            <w:r>
+              <w:rPr>
+                <w:color w:val="334155"/>
+                <w:sz w:val="16"/>
+              </w:rPr>
+              <w:t>Cash on Delivery (COD)</w:t>
+            </w:r>
+          </w:p>
+        </w:tc>
+        <w:tc>
+          <w:tcPr>
+            <w:tcW w:type="dxa" w:w="1440"/>
+            <w:shd w:fill="F8FAFC"/>
+            <w:tcMar>
+              <w:top w:w="70" w:type="dxa"/>
+              <w:bottom w:w="70" w:type="dxa"/>
+              <w:left w:w="120" w:type="dxa"/>
+              <w:right w:w="120" w:type="dxa"/>
+            </w:tcMar>
+          </w:tcPr>
+          <w:p>
+            <w:r>
+              <w:rPr>
+                <w:color w:val="334155"/>
+                <w:sz w:val="16"/>
+              </w:rPr>
+              <w:t>Physical Tender</w:t>
+            </w:r>
+          </w:p>
+        </w:tc>
+        <w:tc>
+          <w:tcPr>
+            <w:tcW w:type="dxa" w:w="1440"/>
+            <w:shd w:fill="F8FAFC"/>
+            <w:tcMar>
+              <w:top w:w="70" w:type="dxa"/>
+              <w:bottom w:w="70" w:type="dxa"/>
+              <w:left w:w="120" w:type="dxa"/>
+              <w:right w:w="120" w:type="dxa"/>
+            </w:tcMar>
+          </w:tcPr>
+          <w:p>
+            <w:r>
+              <w:rPr>
+                <w:color w:val="334155"/>
+                <w:sz w:val="16"/>
+              </w:rPr>
+              <w:t>₹55.23 Cr</w:t>
+            </w:r>
+          </w:p>
+        </w:tc>
+        <w:tc>
+          <w:tcPr>
+            <w:tcW w:type="dxa" w:w="1440"/>
+            <w:shd w:fill="F8FAFC"/>
+            <w:tcMar>
+              <w:top w:w="70" w:type="dxa"/>
+              <w:bottom w:w="70" w:type="dxa"/>
+              <w:left w:w="120" w:type="dxa"/>
+              <w:right w:w="120" w:type="dxa"/>
+            </w:tcMar>
+          </w:tcPr>
+          <w:p>
+            <w:r>
+              <w:rPr>
+                <w:color w:val="334155"/>
+                <w:sz w:val="16"/>
+              </w:rPr>
+              <w:t>7.88%</w:t>
+            </w:r>
+          </w:p>
+        </w:tc>
+        <w:tc>
+          <w:tcPr>
+            <w:tcW w:type="dxa" w:w="1440"/>
+            <w:shd w:fill="F8FAFC"/>
+            <w:tcMar>
+              <w:top w:w="70" w:type="dxa"/>
+              <w:bottom w:w="70" w:type="dxa"/>
+              <w:left w:w="120" w:type="dxa"/>
+              <w:right w:w="120" w:type="dxa"/>
+            </w:tcMar>
+          </w:tcPr>
+          <w:p>
+            <w:r>
+              <w:rPr>
+                <w:color w:val="334155"/>
+                <w:sz w:val="16"/>
+              </w:rPr>
+              <w:t>Cash Handling Fee</w:t>
+            </w:r>
+          </w:p>
+        </w:tc>
+        <w:tc>
+          <w:tcPr>
+            <w:tcW w:type="dxa" w:w="1440"/>
+            <w:shd w:fill="F8FAFC"/>
+            <w:tcMar>
+              <w:top w:w="70" w:type="dxa"/>
+              <w:bottom w:w="70" w:type="dxa"/>
+              <w:left w:w="120" w:type="dxa"/>
+              <w:right w:w="120" w:type="dxa"/>
+            </w:tcMar>
+          </w:tcPr>
+          <w:p>
+            <w:r>
+              <w:rPr>
+                <w:color w:val="334155"/>
+                <w:sz w:val="16"/>
+              </w:rPr>
+              <w:t>High (8.9% Return)</w:t>
             </w:r>
           </w:p>
         </w:tc>
@@ -2363,7 +3345,7 @@
     </w:tbl>
     <w:p>
       <w:pPr>
-        <w:spacing w:after="200"/>
+        <w:spacing w:after="160"/>
       </w:pPr>
     </w:p>
     <w:p>
@@ -2374,600 +3356,7 @@
         <w:rPr>
           <w:b/>
           <w:color w:val="1E293B"/>
-          <w:sz w:val="28"/>
-        </w:rPr>
-        <w:t>3. Treasury Cash Liquidity &amp; Payment Tender Performance</w:t>
-      </w:r>
-    </w:p>
-    <w:p>
-      <w:r>
-        <w:t>Settlement tender mix across digital and physical customer payment rails.</w:t>
-      </w:r>
-    </w:p>
-    <w:tbl>
-      <w:tblPr>
-        <w:tblW w:type="auto" w:w="0"/>
-        <w:jc w:val="center"/>
-        <w:tblLayout w:type="fixed"/>
-        <w:tblLook w:firstColumn="1" w:firstRow="1" w:lastColumn="0" w:lastRow="0" w:noHBand="0" w:noVBand="1" w:val="04A0"/>
-      </w:tblPr>
-      <w:tblGrid>
-        <w:gridCol w:w="1728"/>
-        <w:gridCol w:w="1728"/>
-        <w:gridCol w:w="1728"/>
-        <w:gridCol w:w="1728"/>
-        <w:gridCol w:w="1728"/>
-      </w:tblGrid>
-      <w:tr>
-        <w:tc>
-          <w:tcPr>
-            <w:tcW w:type="dxa" w:w="1728"/>
-            <w:shd w:fill="0F172A"/>
-            <w:tcMar>
-              <w:top w:w="120" w:type="dxa"/>
-              <w:bottom w:w="120" w:type="dxa"/>
-              <w:left w:w="140" w:type="dxa"/>
-              <w:right w:w="140" w:type="dxa"/>
-            </w:tcMar>
-          </w:tcPr>
-          <w:p>
-            <w:pPr>
-              <w:jc w:val="left"/>
-            </w:pPr>
-            <w:r>
-              <w:rPr>
-                <w:b/>
-                <w:color w:val="FFFFFF"/>
-                <w:sz w:val="18"/>
-              </w:rPr>
-              <w:t>Payment Tender Mode</w:t>
-            </w:r>
-          </w:p>
-        </w:tc>
-        <w:tc>
-          <w:tcPr>
-            <w:tcW w:type="dxa" w:w="1728"/>
-            <w:shd w:fill="0F172A"/>
-            <w:tcMar>
-              <w:top w:w="120" w:type="dxa"/>
-              <w:bottom w:w="120" w:type="dxa"/>
-              <w:left w:w="140" w:type="dxa"/>
-              <w:right w:w="140" w:type="dxa"/>
-            </w:tcMar>
-          </w:tcPr>
-          <w:p>
-            <w:pPr>
-              <w:jc w:val="left"/>
-            </w:pPr>
-            <w:r>
-              <w:rPr>
-                <w:b/>
-                <w:color w:val="FFFFFF"/>
-                <w:sz w:val="18"/>
-              </w:rPr>
-              <w:t>Transaction Count</w:t>
-            </w:r>
-          </w:p>
-        </w:tc>
-        <w:tc>
-          <w:tcPr>
-            <w:tcW w:type="dxa" w:w="1728"/>
-            <w:shd w:fill="0F172A"/>
-            <w:tcMar>
-              <w:top w:w="120" w:type="dxa"/>
-              <w:bottom w:w="120" w:type="dxa"/>
-              <w:left w:w="140" w:type="dxa"/>
-              <w:right w:w="140" w:type="dxa"/>
-            </w:tcMar>
-          </w:tcPr>
-          <w:p>
-            <w:pPr>
-              <w:jc w:val="left"/>
-            </w:pPr>
-            <w:r>
-              <w:rPr>
-                <w:b/>
-                <w:color w:val="FFFFFF"/>
-                <w:sz w:val="18"/>
-              </w:rPr>
-              <w:t>Gross Value (₹)</w:t>
-            </w:r>
-          </w:p>
-        </w:tc>
-        <w:tc>
-          <w:tcPr>
-            <w:tcW w:type="dxa" w:w="1728"/>
-            <w:shd w:fill="0F172A"/>
-            <w:tcMar>
-              <w:top w:w="120" w:type="dxa"/>
-              <w:bottom w:w="120" w:type="dxa"/>
-              <w:left w:w="140" w:type="dxa"/>
-              <w:right w:w="140" w:type="dxa"/>
-            </w:tcMar>
-          </w:tcPr>
-          <w:p>
-            <w:pPr>
-              <w:jc w:val="left"/>
-            </w:pPr>
-            <w:r>
-              <w:rPr>
-                <w:b/>
-                <w:color w:val="FFFFFF"/>
-                <w:sz w:val="18"/>
-              </w:rPr>
-              <w:t>Settlement Fee Rate</w:t>
-            </w:r>
-          </w:p>
-        </w:tc>
-        <w:tc>
-          <w:tcPr>
-            <w:tcW w:type="dxa" w:w="1728"/>
-            <w:shd w:fill="0F172A"/>
-            <w:tcMar>
-              <w:top w:w="120" w:type="dxa"/>
-              <w:bottom w:w="120" w:type="dxa"/>
-              <w:left w:w="140" w:type="dxa"/>
-              <w:right w:w="140" w:type="dxa"/>
-            </w:tcMar>
-          </w:tcPr>
-          <w:p>
-            <w:pPr>
-              <w:jc w:val="left"/>
-            </w:pPr>
-            <w:r>
-              <w:rPr>
-                <w:b/>
-                <w:color w:val="FFFFFF"/>
-                <w:sz w:val="18"/>
-              </w:rPr>
-              <w:t>Dispute / Return Rate</w:t>
-            </w:r>
-          </w:p>
-        </w:tc>
-      </w:tr>
-      <w:tr>
-        <w:tc>
-          <w:tcPr>
-            <w:tcW w:type="dxa" w:w="1728"/>
-            <w:shd w:fill="FFFFFF"/>
-            <w:tcMar>
-              <w:top w:w="80" w:type="dxa"/>
-              <w:bottom w:w="80" w:type="dxa"/>
-              <w:left w:w="140" w:type="dxa"/>
-              <w:right w:w="140" w:type="dxa"/>
-            </w:tcMar>
-          </w:tcPr>
-          <w:p>
-            <w:r>
-              <w:rPr>
-                <w:color w:val="334155"/>
-                <w:sz w:val="17"/>
-              </w:rPr>
-              <w:t>UPI (Unified Payments)</w:t>
-            </w:r>
-          </w:p>
-        </w:tc>
-        <w:tc>
-          <w:tcPr>
-            <w:tcW w:type="dxa" w:w="1728"/>
-            <w:shd w:fill="FFFFFF"/>
-            <w:tcMar>
-              <w:top w:w="80" w:type="dxa"/>
-              <w:bottom w:w="80" w:type="dxa"/>
-              <w:left w:w="140" w:type="dxa"/>
-              <w:right w:w="140" w:type="dxa"/>
-            </w:tcMar>
-          </w:tcPr>
-          <w:p>
-            <w:r>
-              <w:rPr>
-                <w:color w:val="334155"/>
-                <w:sz w:val="17"/>
-              </w:rPr>
-              <w:t>62,400</w:t>
-            </w:r>
-          </w:p>
-        </w:tc>
-        <w:tc>
-          <w:tcPr>
-            <w:tcW w:type="dxa" w:w="1728"/>
-            <w:shd w:fill="FFFFFF"/>
-            <w:tcMar>
-              <w:top w:w="80" w:type="dxa"/>
-              <w:bottom w:w="80" w:type="dxa"/>
-              <w:left w:w="140" w:type="dxa"/>
-              <w:right w:w="140" w:type="dxa"/>
-            </w:tcMar>
-          </w:tcPr>
-          <w:p>
-            <w:r>
-              <w:rPr>
-                <w:color w:val="334155"/>
-                <w:sz w:val="17"/>
-              </w:rPr>
-              <w:t>₹312.40 Cr</w:t>
-            </w:r>
-          </w:p>
-        </w:tc>
-        <w:tc>
-          <w:tcPr>
-            <w:tcW w:type="dxa" w:w="1728"/>
-            <w:shd w:fill="FFFFFF"/>
-            <w:tcMar>
-              <w:top w:w="80" w:type="dxa"/>
-              <w:bottom w:w="80" w:type="dxa"/>
-              <w:left w:w="140" w:type="dxa"/>
-              <w:right w:w="140" w:type="dxa"/>
-            </w:tcMar>
-          </w:tcPr>
-          <w:p>
-            <w:r>
-              <w:rPr>
-                <w:color w:val="334155"/>
-                <w:sz w:val="17"/>
-              </w:rPr>
-              <w:t>0.00% (Zero MDR)</w:t>
-            </w:r>
-          </w:p>
-        </w:tc>
-        <w:tc>
-          <w:tcPr>
-            <w:tcW w:type="dxa" w:w="1728"/>
-            <w:shd w:fill="FFFFFF"/>
-            <w:tcMar>
-              <w:top w:w="80" w:type="dxa"/>
-              <w:bottom w:w="80" w:type="dxa"/>
-              <w:left w:w="140" w:type="dxa"/>
-              <w:right w:w="140" w:type="dxa"/>
-            </w:tcMar>
-          </w:tcPr>
-          <w:p>
-            <w:r>
-              <w:rPr>
-                <w:color w:val="334155"/>
-                <w:sz w:val="17"/>
-              </w:rPr>
-              <w:t>1.20% (Lowest)</w:t>
-            </w:r>
-          </w:p>
-        </w:tc>
-      </w:tr>
-      <w:tr>
-        <w:tc>
-          <w:tcPr>
-            <w:tcW w:type="dxa" w:w="1728"/>
-            <w:shd w:fill="F8FAFC"/>
-            <w:tcMar>
-              <w:top w:w="80" w:type="dxa"/>
-              <w:bottom w:w="80" w:type="dxa"/>
-              <w:left w:w="140" w:type="dxa"/>
-              <w:right w:w="140" w:type="dxa"/>
-            </w:tcMar>
-          </w:tcPr>
-          <w:p>
-            <w:r>
-              <w:rPr>
-                <w:color w:val="334155"/>
-                <w:sz w:val="17"/>
-              </w:rPr>
-              <w:t>Credit &amp; Debit Cards</w:t>
-            </w:r>
-          </w:p>
-        </w:tc>
-        <w:tc>
-          <w:tcPr>
-            <w:tcW w:type="dxa" w:w="1728"/>
-            <w:shd w:fill="F8FAFC"/>
-            <w:tcMar>
-              <w:top w:w="80" w:type="dxa"/>
-              <w:bottom w:w="80" w:type="dxa"/>
-              <w:left w:w="140" w:type="dxa"/>
-              <w:right w:w="140" w:type="dxa"/>
-            </w:tcMar>
-          </w:tcPr>
-          <w:p>
-            <w:r>
-              <w:rPr>
-                <w:color w:val="334155"/>
-                <w:sz w:val="17"/>
-              </w:rPr>
-              <w:t>48,200</w:t>
-            </w:r>
-          </w:p>
-        </w:tc>
-        <w:tc>
-          <w:tcPr>
-            <w:tcW w:type="dxa" w:w="1728"/>
-            <w:shd w:fill="F8FAFC"/>
-            <w:tcMar>
-              <w:top w:w="80" w:type="dxa"/>
-              <w:bottom w:w="80" w:type="dxa"/>
-              <w:left w:w="140" w:type="dxa"/>
-              <w:right w:w="140" w:type="dxa"/>
-            </w:tcMar>
-          </w:tcPr>
-          <w:p>
-            <w:r>
-              <w:rPr>
-                <w:color w:val="334155"/>
-                <w:sz w:val="17"/>
-              </w:rPr>
-              <w:t>₹241.10 Cr</w:t>
-            </w:r>
-          </w:p>
-        </w:tc>
-        <w:tc>
-          <w:tcPr>
-            <w:tcW w:type="dxa" w:w="1728"/>
-            <w:shd w:fill="F8FAFC"/>
-            <w:tcMar>
-              <w:top w:w="80" w:type="dxa"/>
-              <w:bottom w:w="80" w:type="dxa"/>
-              <w:left w:w="140" w:type="dxa"/>
-              <w:right w:w="140" w:type="dxa"/>
-            </w:tcMar>
-          </w:tcPr>
-          <w:p>
-            <w:r>
-              <w:rPr>
-                <w:color w:val="334155"/>
-                <w:sz w:val="17"/>
-              </w:rPr>
-              <w:t>1.50% Interchange</w:t>
-            </w:r>
-          </w:p>
-        </w:tc>
-        <w:tc>
-          <w:tcPr>
-            <w:tcW w:type="dxa" w:w="1728"/>
-            <w:shd w:fill="F8FAFC"/>
-            <w:tcMar>
-              <w:top w:w="80" w:type="dxa"/>
-              <w:bottom w:w="80" w:type="dxa"/>
-              <w:left w:w="140" w:type="dxa"/>
-              <w:right w:w="140" w:type="dxa"/>
-            </w:tcMar>
-          </w:tcPr>
-          <w:p>
-            <w:r>
-              <w:rPr>
-                <w:color w:val="334155"/>
-                <w:sz w:val="17"/>
-              </w:rPr>
-              <w:t>2.80% Disputes</w:t>
-            </w:r>
-          </w:p>
-        </w:tc>
-      </w:tr>
-      <w:tr>
-        <w:tc>
-          <w:tcPr>
-            <w:tcW w:type="dxa" w:w="1728"/>
-            <w:shd w:fill="FFFFFF"/>
-            <w:tcMar>
-              <w:top w:w="80" w:type="dxa"/>
-              <w:bottom w:w="80" w:type="dxa"/>
-              <w:left w:w="140" w:type="dxa"/>
-              <w:right w:w="140" w:type="dxa"/>
-            </w:tcMar>
-          </w:tcPr>
-          <w:p>
-            <w:r>
-              <w:rPr>
-                <w:color w:val="334155"/>
-                <w:sz w:val="17"/>
-              </w:rPr>
-              <w:t>Net Banking / RTGS</w:t>
-            </w:r>
-          </w:p>
-        </w:tc>
-        <w:tc>
-          <w:tcPr>
-            <w:tcW w:type="dxa" w:w="1728"/>
-            <w:shd w:fill="FFFFFF"/>
-            <w:tcMar>
-              <w:top w:w="80" w:type="dxa"/>
-              <w:bottom w:w="80" w:type="dxa"/>
-              <w:left w:w="140" w:type="dxa"/>
-              <w:right w:w="140" w:type="dxa"/>
-            </w:tcMar>
-          </w:tcPr>
-          <w:p>
-            <w:r>
-              <w:rPr>
-                <w:color w:val="334155"/>
-                <w:sz w:val="17"/>
-              </w:rPr>
-              <w:t>18,500</w:t>
-            </w:r>
-          </w:p>
-        </w:tc>
-        <w:tc>
-          <w:tcPr>
-            <w:tcW w:type="dxa" w:w="1728"/>
-            <w:shd w:fill="FFFFFF"/>
-            <w:tcMar>
-              <w:top w:w="80" w:type="dxa"/>
-              <w:bottom w:w="80" w:type="dxa"/>
-              <w:left w:w="140" w:type="dxa"/>
-              <w:right w:w="140" w:type="dxa"/>
-            </w:tcMar>
-          </w:tcPr>
-          <w:p>
-            <w:r>
-              <w:rPr>
-                <w:color w:val="334155"/>
-                <w:sz w:val="17"/>
-              </w:rPr>
-              <w:t>₹92.50 Cr</w:t>
-            </w:r>
-          </w:p>
-        </w:tc>
-        <w:tc>
-          <w:tcPr>
-            <w:tcW w:type="dxa" w:w="1728"/>
-            <w:shd w:fill="FFFFFF"/>
-            <w:tcMar>
-              <w:top w:w="80" w:type="dxa"/>
-              <w:bottom w:w="80" w:type="dxa"/>
-              <w:left w:w="140" w:type="dxa"/>
-              <w:right w:w="140" w:type="dxa"/>
-            </w:tcMar>
-          </w:tcPr>
-          <w:p>
-            <w:r>
-              <w:rPr>
-                <w:color w:val="334155"/>
-                <w:sz w:val="17"/>
-              </w:rPr>
-              <w:t>₹15 Fixed Transfer</w:t>
-            </w:r>
-          </w:p>
-        </w:tc>
-        <w:tc>
-          <w:tcPr>
-            <w:tcW w:type="dxa" w:w="1728"/>
-            <w:shd w:fill="FFFFFF"/>
-            <w:tcMar>
-              <w:top w:w="80" w:type="dxa"/>
-              <w:bottom w:w="80" w:type="dxa"/>
-              <w:left w:w="140" w:type="dxa"/>
-              <w:right w:w="140" w:type="dxa"/>
-            </w:tcMar>
-          </w:tcPr>
-          <w:p>
-            <w:r>
-              <w:rPr>
-                <w:color w:val="334155"/>
-                <w:sz w:val="17"/>
-              </w:rPr>
-              <w:t>0.80% Discrepancies</w:t>
-            </w:r>
-          </w:p>
-        </w:tc>
-      </w:tr>
-      <w:tr>
-        <w:tc>
-          <w:tcPr>
-            <w:tcW w:type="dxa" w:w="1728"/>
-            <w:shd w:fill="F8FAFC"/>
-            <w:tcMar>
-              <w:top w:w="80" w:type="dxa"/>
-              <w:bottom w:w="80" w:type="dxa"/>
-              <w:left w:w="140" w:type="dxa"/>
-              <w:right w:w="140" w:type="dxa"/>
-            </w:tcMar>
-          </w:tcPr>
-          <w:p>
-            <w:r>
-              <w:rPr>
-                <w:color w:val="334155"/>
-                <w:sz w:val="17"/>
-              </w:rPr>
-              <w:t>Cash on Delivery (COD)</w:t>
-            </w:r>
-          </w:p>
-        </w:tc>
-        <w:tc>
-          <w:tcPr>
-            <w:tcW w:type="dxa" w:w="1728"/>
-            <w:shd w:fill="F8FAFC"/>
-            <w:tcMar>
-              <w:top w:w="80" w:type="dxa"/>
-              <w:bottom w:w="80" w:type="dxa"/>
-              <w:left w:w="140" w:type="dxa"/>
-              <w:right w:w="140" w:type="dxa"/>
-            </w:tcMar>
-          </w:tcPr>
-          <w:p>
-            <w:r>
-              <w:rPr>
-                <w:color w:val="334155"/>
-                <w:sz w:val="17"/>
-              </w:rPr>
-              <w:t>13,440</w:t>
-            </w:r>
-          </w:p>
-        </w:tc>
-        <w:tc>
-          <w:tcPr>
-            <w:tcW w:type="dxa" w:w="1728"/>
-            <w:shd w:fill="F8FAFC"/>
-            <w:tcMar>
-              <w:top w:w="80" w:type="dxa"/>
-              <w:bottom w:w="80" w:type="dxa"/>
-              <w:left w:w="140" w:type="dxa"/>
-              <w:right w:w="140" w:type="dxa"/>
-            </w:tcMar>
-          </w:tcPr>
-          <w:p>
-            <w:r>
-              <w:rPr>
-                <w:color w:val="334155"/>
-                <w:sz w:val="17"/>
-              </w:rPr>
-              <w:t>₹55.23 Cr</w:t>
-            </w:r>
-          </w:p>
-        </w:tc>
-        <w:tc>
-          <w:tcPr>
-            <w:tcW w:type="dxa" w:w="1728"/>
-            <w:shd w:fill="F8FAFC"/>
-            <w:tcMar>
-              <w:top w:w="80" w:type="dxa"/>
-              <w:bottom w:w="80" w:type="dxa"/>
-              <w:left w:w="140" w:type="dxa"/>
-              <w:right w:w="140" w:type="dxa"/>
-            </w:tcMar>
-          </w:tcPr>
-          <w:p>
-            <w:r>
-              <w:rPr>
-                <w:color w:val="334155"/>
-                <w:sz w:val="17"/>
-              </w:rPr>
-              <w:t>₹45 Cash Handling</w:t>
-            </w:r>
-          </w:p>
-        </w:tc>
-        <w:tc>
-          <w:tcPr>
-            <w:tcW w:type="dxa" w:w="1728"/>
-            <w:shd w:fill="F8FAFC"/>
-            <w:tcMar>
-              <w:top w:w="80" w:type="dxa"/>
-              <w:bottom w:w="80" w:type="dxa"/>
-              <w:left w:w="140" w:type="dxa"/>
-              <w:right w:w="140" w:type="dxa"/>
-            </w:tcMar>
-          </w:tcPr>
-          <w:p>
-            <w:r>
-              <w:rPr>
-                <w:color w:val="334155"/>
-                <w:sz w:val="17"/>
-              </w:rPr>
-              <w:t>8.90% High Return Risk</w:t>
-            </w:r>
-          </w:p>
-        </w:tc>
-      </w:tr>
-    </w:tbl>
-    <w:p>
-      <w:pPr>
-        <w:spacing w:after="200"/>
-      </w:pPr>
-    </w:p>
-    <w:p>
-      <w:pPr>
-        <w:spacing w:before="280" w:after="120"/>
-      </w:pPr>
-      <w:r>
-        <w:rPr>
-          <w:b/>
-          <w:color w:val="1E293B"/>
-          <w:sz w:val="28"/>
+          <w:sz w:val="26"/>
         </w:rPr>
         <w:t>Authoritative Production SQL Queries</w:t>
       </w:r>
@@ -2977,12 +3366,12 @@
         <w:rPr>
           <w:b/>
         </w:rPr>
-        <w:t>SQL 3.1: Active Enterprise Workforce Headcount &amp; Payroll Summary (Grain: Department Master Grain)</w:t>
+        <w:t>SQL 3.1: Department Headcount &amp; Monthly Payroll Allocation (Grain: Department Master Grain)</w:t>
       </w:r>
     </w:p>
     <w:p>
       <w:r>
-        <w:t>Business Purpose: Aggregates employee headcount, total base salary obligations, and mean compensation across departments.</w:t>
+        <w:t>Business Purpose: Aggregates employee headcount, total base payroll, and average compensation across departments.</w:t>
       </w:r>
     </w:p>
     <w:tbl>
@@ -3000,10 +3389,10 @@
             <w:tcW w:type="dxa" w:w="8640"/>
             <w:shd w:fill="F1F5F9"/>
             <w:tcMar>
-              <w:top w:w="120" w:type="dxa"/>
-              <w:bottom w:w="120" w:type="dxa"/>
-              <w:left w:w="160" w:type="dxa"/>
-              <w:right w:w="160" w:type="dxa"/>
+              <w:top w:w="100" w:type="dxa"/>
+              <w:bottom w:w="100" w:type="dxa"/>
+              <w:left w:w="140" w:type="dxa"/>
+              <w:right w:w="140" w:type="dxa"/>
             </w:tcMar>
           </w:tcPr>
           <w:p>
@@ -3014,13 +3403,9 @@
               <w:rPr>
                 <w:rFonts w:ascii="Consolas" w:hAnsi="Consolas"/>
                 <w:color w:val="1E293B"/>
-                <w:sz w:val="17"/>
+                <w:sz w:val="16"/>
               </w:rPr>
-              <w:t xml:space="preserve">SELECT </w:t>
-              <w:br/>
-              <w:t xml:space="preserve">    d.department_name,</w:t>
-              <w:br/>
-              <w:t xml:space="preserve">    COUNT(e.employee_id) AS total_employees,</w:t>
+              <w:t>SELECT d.department_name, COUNT(e.employee_id) AS total_employees,</w:t>
               <w:br/>
               <w:t xml:space="preserve">    ROUND(SUM(e.salary), 2) AS monthly_base_payroll,</w:t>
               <w:br/>
@@ -3032,9 +3417,7 @@
               <w:br/>
               <w:t>JOIN hr.dim_department d ON e.department_id = d.department_id</w:t>
               <w:br/>
-              <w:t>GROUP BY d.department_name</w:t>
-              <w:br/>
-              <w:t>ORDER BY total_employees DESC;</w:t>
+              <w:t>GROUP BY d.department_name ORDER BY total_employees DESC;</w:t>
             </w:r>
           </w:p>
         </w:tc>
@@ -3042,7 +3425,7 @@
     </w:tbl>
     <w:p>
       <w:pPr>
-        <w:spacing w:after="160"/>
+        <w:spacing w:after="120"/>
       </w:pPr>
     </w:p>
     <w:p>
@@ -3050,12 +3433,12 @@
         <w:rPr>
           <w:b/>
         </w:rPr>
-        <w:t>SQL 3.2: Monthly Processed Salary Payout Timeline (Grain: Payment Month Grain)</w:t>
+        <w:t>SQL 3.2: Corporate Overhead Expenditure by Category (Grain: Corporate Expense Category Grain)</w:t>
       </w:r>
     </w:p>
     <w:p>
       <w:r>
-        <w:t>Business Purpose: Tracks monthly disbursed cash compensation through banking channels.</w:t>
+        <w:t>Business Purpose: Reconciles top corporate non-payroll operating expenditures.</w:t>
       </w:r>
     </w:p>
     <w:tbl>
@@ -3073,10 +3456,10 @@
             <w:tcW w:type="dxa" w:w="8640"/>
             <w:shd w:fill="F1F5F9"/>
             <w:tcMar>
-              <w:top w:w="120" w:type="dxa"/>
-              <w:bottom w:w="120" w:type="dxa"/>
-              <w:left w:w="160" w:type="dxa"/>
-              <w:right w:w="160" w:type="dxa"/>
+              <w:top w:w="100" w:type="dxa"/>
+              <w:bottom w:w="100" w:type="dxa"/>
+              <w:left w:w="140" w:type="dxa"/>
+              <w:right w:w="140" w:type="dxa"/>
             </w:tcMar>
           </w:tcPr>
           <w:p>
@@ -3087,25 +3470,19 @@
               <w:rPr>
                 <w:rFonts w:ascii="Consolas" w:hAnsi="Consolas"/>
                 <w:color w:val="1E293B"/>
-                <w:sz w:val="17"/>
+                <w:sz w:val="16"/>
               </w:rPr>
-              <w:t xml:space="preserve">SELECT </w:t>
+              <w:t>SELECT c.category_name, COUNT(e.expense_id) AS voucher_count,</w:t>
               <w:br/>
-              <w:t xml:space="preserve">    DATE_TRUNC('month', payment_date)::date AS payout_month,</w:t>
+              <w:t xml:space="preserve">    ROUND(SUM(e.amount) / 10000000.0, 2) AS total_crores,</w:t>
               <w:br/>
-              <w:t xml:space="preserve">    COUNT(history_id) AS disbursements_count,</w:t>
+              <w:t xml:space="preserve">    ROUND(SUM(e.amount) / SUM(SUM(e.amount)) OVER () * 100, 2) AS share_pct</w:t>
               <w:br/>
-              <w:t xml:space="preserve">    ROUND(SUM(amount), 2) AS total_cash_payout,</w:t>
+              <w:t>FROM finance.expenses e</w:t>
               <w:br/>
-              <w:t xml:space="preserve">    ROUND(AVG(amount), 2) AS avg_payout</w:t>
+              <w:t>JOIN finance.dim_expense_category c ON e.category_id = c.category_id</w:t>
               <w:br/>
-              <w:t>FROM hr.salary_history</w:t>
-              <w:br/>
-              <w:t>WHERE status = 'Processed'</w:t>
-              <w:br/>
-              <w:t>GROUP BY DATE_TRUNC('month', payment_date)</w:t>
-              <w:br/>
-              <w:t>ORDER BY payout_month;</w:t>
+              <w:t>GROUP BY c.category_name ORDER BY total_crores DESC LIMIT 8;</w:t>
             </w:r>
           </w:p>
         </w:tc>
@@ -3113,171 +3490,7 @@
     </w:tbl>
     <w:p>
       <w:pPr>
-        <w:spacing w:after="160"/>
-      </w:pPr>
-    </w:p>
-    <w:p>
-      <w:r>
-        <w:rPr>
-          <w:b/>
-        </w:rPr>
-        <w:t>SQL 3.3: Corporate vs Store Operating Expenditure (OPEX) (Grain: Expense Category Grain)</w:t>
-      </w:r>
-    </w:p>
-    <w:p>
-      <w:r>
-        <w:t>Business Purpose: Reconciles overhead expenses across headquarters corporate ledger and physical store ledgers.</w:t>
-      </w:r>
-    </w:p>
-    <w:tbl>
-      <w:tblPr>
-        <w:tblW w:type="auto" w:w="0"/>
-        <w:jc w:val="center"/>
-        <w:tblLook w:firstColumn="1" w:firstRow="1" w:lastColumn="0" w:lastRow="0" w:noHBand="0" w:noVBand="1" w:val="04A0"/>
-      </w:tblPr>
-      <w:tblGrid>
-        <w:gridCol w:w="8640"/>
-      </w:tblGrid>
-      <w:tr>
-        <w:tc>
-          <w:tcPr>
-            <w:tcW w:type="dxa" w:w="8640"/>
-            <w:shd w:fill="F1F5F9"/>
-            <w:tcMar>
-              <w:top w:w="120" w:type="dxa"/>
-              <w:bottom w:w="120" w:type="dxa"/>
-              <w:left w:w="160" w:type="dxa"/>
-              <w:right w:w="160" w:type="dxa"/>
-            </w:tcMar>
-          </w:tcPr>
-          <w:p>
-            <w:pPr>
-              <w:spacing w:after="0"/>
-            </w:pPr>
-            <w:r>
-              <w:rPr>
-                <w:rFonts w:ascii="Consolas" w:hAnsi="Consolas"/>
-                <w:color w:val="1E293B"/>
-                <w:sz w:val="17"/>
-              </w:rPr>
-              <w:t xml:space="preserve">SELECT </w:t>
-              <w:br/>
-              <w:t xml:space="preserve">    'Corporate Expenses' AS expense_source,</w:t>
-              <w:br/>
-              <w:t xml:space="preserve">    c.category_name,</w:t>
-              <w:br/>
-              <w:t xml:space="preserve">    COUNT(e.expense_id) AS voucher_count,</w:t>
-              <w:br/>
-              <w:t xml:space="preserve">    ROUND(SUM(e.amount), 2) AS total_expenditure</w:t>
-              <w:br/>
-              <w:t>FROM finance.expenses e</w:t>
-              <w:br/>
-              <w:t>JOIN finance.dim_expense_category c ON e.category_id = c.category_id</w:t>
-              <w:br/>
-              <w:t>GROUP BY c.category_name</w:t>
-              <w:br/>
-              <w:br/>
-              <w:t>UNION ALL</w:t>
-              <w:br/>
-              <w:br/>
-              <w:t xml:space="preserve">SELECT </w:t>
-              <w:br/>
-              <w:t xml:space="preserve">    'Store Expenses' AS expense_source,</w:t>
-              <w:br/>
-              <w:t xml:space="preserve">    c.category_name,</w:t>
-              <w:br/>
-              <w:t xml:space="preserve">    COUNT(e.expense_id) AS voucher_count,</w:t>
-              <w:br/>
-              <w:t xml:space="preserve">    ROUND(SUM(e.amount), 2) AS total_expenditure</w:t>
-              <w:br/>
-              <w:t>FROM stores.expenses e</w:t>
-              <w:br/>
-              <w:t>JOIN finance.dim_expense_category c ON e.category_id = c.category_id</w:t>
-              <w:br/>
-              <w:t>GROUP BY c.category_name</w:t>
-              <w:br/>
-              <w:t>ORDER BY total_expenditure DESC;</w:t>
-            </w:r>
-          </w:p>
-        </w:tc>
-      </w:tr>
-    </w:tbl>
-    <w:p>
-      <w:pPr>
-        <w:spacing w:after="160"/>
-      </w:pPr>
-    </w:p>
-    <w:p>
-      <w:r>
-        <w:rPr>
-          <w:b/>
-        </w:rPr>
-        <w:t>SQL 3.4: Payment Tender Performance &amp; Settlement Volume (Grain: Payment Mode Grain)</w:t>
-      </w:r>
-    </w:p>
-    <w:p>
-      <w:r>
-        <w:t>Business Purpose: Evaluates customer tender mode distribution, cash collections, and electronic payment velocities.</w:t>
-      </w:r>
-    </w:p>
-    <w:tbl>
-      <w:tblPr>
-        <w:tblW w:type="auto" w:w="0"/>
-        <w:jc w:val="center"/>
-        <w:tblLook w:firstColumn="1" w:firstRow="1" w:lastColumn="0" w:lastRow="0" w:noHBand="0" w:noVBand="1" w:val="04A0"/>
-      </w:tblPr>
-      <w:tblGrid>
-        <w:gridCol w:w="8640"/>
-      </w:tblGrid>
-      <w:tr>
-        <w:tc>
-          <w:tcPr>
-            <w:tcW w:type="dxa" w:w="8640"/>
-            <w:shd w:fill="F1F5F9"/>
-            <w:tcMar>
-              <w:top w:w="120" w:type="dxa"/>
-              <w:bottom w:w="120" w:type="dxa"/>
-              <w:left w:w="160" w:type="dxa"/>
-              <w:right w:w="160" w:type="dxa"/>
-            </w:tcMar>
-          </w:tcPr>
-          <w:p>
-            <w:pPr>
-              <w:spacing w:after="0"/>
-            </w:pPr>
-            <w:r>
-              <w:rPr>
-                <w:rFonts w:ascii="Consolas" w:hAnsi="Consolas"/>
-                <w:color w:val="1E293B"/>
-                <w:sz w:val="17"/>
-              </w:rPr>
-              <w:t xml:space="preserve">SELECT </w:t>
-              <w:br/>
-              <w:t xml:space="preserve">    payment_mode,</w:t>
-              <w:br/>
-              <w:t xml:space="preserve">    payment_status,</w:t>
-              <w:br/>
-              <w:t xml:space="preserve">    COUNT(payment_id) AS transaction_count,</w:t>
-              <w:br/>
-              <w:t xml:space="preserve">    ROUND(SUM(amount), 2) AS total_settled_amount,</w:t>
-              <w:br/>
-              <w:t xml:space="preserve">    ROUND(SUM(amount) / SUM(SUM(amount)) OVER () * 100, 2) AS payment_share_pct</w:t>
-              <w:br/>
-              <w:t>FROM sales.payments</w:t>
-              <w:br/>
-              <w:t>WHERE payment_status = 'Success'</w:t>
-              <w:br/>
-              <w:t>GROUP BY payment_mode, payment_status</w:t>
-              <w:br/>
-              <w:t>ORDER BY total_settled_amount DESC;</w:t>
-            </w:r>
-          </w:p>
-        </w:tc>
-      </w:tr>
-    </w:tbl>
-    <w:p>
-      <w:pPr>
-        <w:spacing w:after="160"/>
+        <w:spacing w:after="120"/>
       </w:pPr>
     </w:p>
     <w:sectPr>

</xml_diff>